<commit_message>
Wertungszettel: Untertitel-Zeile entfernen, Tabelle 4-spaltig
Jungscharlager-Namenszeile unter dem Banner weggelassen (unnötig auf
einem Zettel, der eh nur intern am Spielfeld verwendet wird). Nr./Punkt
jetzt als zwei Paare nebeneinander statt einer langen Liste, spart Platz.

Co-Authored-By: Claude Sonnet 5 <noreply@anthropic.com>
Claude-Session: https://claude.ai/code/session_0158aNef5Z2PX38jwmhzm9Cg
</commit_message>
<xml_diff>
--- a/Tagesgruppe_4/8. Tag_Montag_17.08.2026/Geländespiel_Wertungszettel.docx
+++ b/Tagesgruppe_4/8. Tag_Montag_17.08.2026/Geländespiel_Wertungszettel.docx
@@ -63,23 +63,8 @@
     </w:tbl>
     <w:p>
       <w:pPr>
-        <w:spacing w:after="160"/>
-      </w:pPr>
-    </w:p>
-    <w:p>
-      <w:pPr>
         <w:spacing w:after="240"/>
       </w:pPr>
-      <w:r>
-        <w:rPr>
-          <w:i/>
-          <w:iCs/>
-          <w:color w:val="666666"/>
-          <w:sz w:val="19"/>
-          <w:szCs w:val="19"/>
-        </w:rPr>
-        <w:t xml:space="preserve">Jungscharlager „Jo und die starken 7“ · Montag, 17.08.2026 · mittags</w:t>
-      </w:r>
     </w:p>
     <w:p>
       <w:pPr>
@@ -268,8 +253,10 @@
         </w:tblBorders>
       </w:tblPr>
       <w:tblGrid>
-        <w:gridCol w:w="1600"/>
-        <w:gridCol w:w="8606"/>
+        <w:gridCol w:w="1300"/>
+        <w:gridCol w:w="3803"/>
+        <w:gridCol w:w="1300"/>
+        <w:gridCol w:w="3803"/>
       </w:tblGrid>
       <w:tr>
         <w:trPr>
@@ -277,7 +264,7 @@
         </w:trPr>
         <w:tc>
           <w:tcPr>
-            <w:tcW w:type="dxa" w:w="1600"/>
+            <w:tcW w:type="dxa" w:w="1300"/>
             <w:shd w:fill="1F3B4D" w:val="clear"/>
             <w:tcMar>
               <w:top w:type="dxa" w:w="100"/>
@@ -302,7 +289,57 @@
         </w:tc>
         <w:tc>
           <w:tcPr>
-            <w:tcW w:type="dxa" w:w="8606"/>
+            <w:tcW w:type="dxa" w:w="3803"/>
+            <w:shd w:fill="1F3B4D" w:val="clear"/>
+            <w:tcMar>
+              <w:top w:type="dxa" w:w="100"/>
+              <w:left w:type="dxa" w:w="120"/>
+              <w:bottom w:type="dxa" w:w="100"/>
+              <w:right w:type="dxa" w:w="120"/>
+            </w:tcMar>
+            <w:vAlign w:val="center"/>
+          </w:tcPr>
+          <w:p>
+            <w:r>
+              <w:rPr>
+                <w:b/>
+                <w:bCs/>
+                <w:color w:val="FFFFFF"/>
+                <w:sz w:val="18"/>
+                <w:szCs w:val="18"/>
+              </w:rPr>
+              <w:t xml:space="preserve">Punkt</w:t>
+            </w:r>
+          </w:p>
+        </w:tc>
+        <w:tc>
+          <w:tcPr>
+            <w:tcW w:type="dxa" w:w="1300"/>
+            <w:shd w:fill="1F3B4D" w:val="clear"/>
+            <w:tcMar>
+              <w:top w:type="dxa" w:w="100"/>
+              <w:left w:type="dxa" w:w="120"/>
+              <w:bottom w:type="dxa" w:w="100"/>
+              <w:right w:type="dxa" w:w="120"/>
+            </w:tcMar>
+            <w:vAlign w:val="center"/>
+          </w:tcPr>
+          <w:p>
+            <w:r>
+              <w:rPr>
+                <w:b/>
+                <w:bCs/>
+                <w:color w:val="FFFFFF"/>
+                <w:sz w:val="18"/>
+                <w:szCs w:val="18"/>
+              </w:rPr>
+              <w:t xml:space="preserve">Nr.</w:t>
+            </w:r>
+          </w:p>
+        </w:tc>
+        <w:tc>
+          <w:tcPr>
+            <w:tcW w:type="dxa" w:w="3803"/>
             <w:shd w:fill="1F3B4D" w:val="clear"/>
             <w:tcMar>
               <w:top w:type="dxa" w:w="100"/>
@@ -332,12 +369,12 @@
         </w:trPr>
         <w:tc>
           <w:tcPr>
-            <w:tcW w:type="dxa" w:w="1600"/>
-            <w:shd w:fill="FFFFFF" w:val="clear"/>
-            <w:tcMar>
-              <w:top w:type="dxa" w:w="60"/>
-              <w:left w:type="dxa" w:w="120"/>
-              <w:bottom w:type="dxa" w:w="60"/>
+            <w:tcW w:type="dxa" w:w="1300"/>
+            <w:shd w:fill="FFFFFF" w:val="clear"/>
+            <w:tcMar>
+              <w:top w:type="dxa" w:w="70"/>
+              <w:left w:type="dxa" w:w="120"/>
+              <w:bottom w:type="dxa" w:w="70"/>
               <w:right w:type="dxa" w:w="120"/>
             </w:tcMar>
             <w:vAlign w:val="center"/>
@@ -355,12 +392,58 @@
         </w:tc>
         <w:tc>
           <w:tcPr>
-            <w:tcW w:type="dxa" w:w="8606"/>
-            <w:shd w:fill="FFFFFF" w:val="clear"/>
-            <w:tcMar>
-              <w:top w:type="dxa" w:w="60"/>
-              <w:left w:type="dxa" w:w="120"/>
-              <w:bottom w:type="dxa" w:w="60"/>
+            <w:tcW w:type="dxa" w:w="3803"/>
+            <w:shd w:fill="FFFFFF" w:val="clear"/>
+            <w:tcMar>
+              <w:top w:type="dxa" w:w="70"/>
+              <w:left w:type="dxa" w:w="120"/>
+              <w:bottom w:type="dxa" w:w="70"/>
+              <w:right w:type="dxa" w:w="120"/>
+            </w:tcMar>
+            <w:vAlign w:val="center"/>
+          </w:tcPr>
+          <w:p>
+            <w:r>
+              <w:rPr>
+                <w:color w:val="222222"/>
+                <w:sz w:val="20"/>
+                <w:szCs w:val="20"/>
+              </w:rPr>
+              <w:t xml:space="preserve">☐</w:t>
+            </w:r>
+          </w:p>
+        </w:tc>
+        <w:tc>
+          <w:tcPr>
+            <w:tcW w:type="dxa" w:w="1300"/>
+            <w:shd w:fill="FFFFFF" w:val="clear"/>
+            <w:tcMar>
+              <w:top w:type="dxa" w:w="70"/>
+              <w:left w:type="dxa" w:w="120"/>
+              <w:bottom w:type="dxa" w:w="70"/>
+              <w:right w:type="dxa" w:w="120"/>
+            </w:tcMar>
+            <w:vAlign w:val="center"/>
+          </w:tcPr>
+          <w:p>
+            <w:r>
+              <w:rPr>
+                <w:color w:val="666666"/>
+                <w:sz w:val="18"/>
+                <w:szCs w:val="18"/>
+              </w:rPr>
+              <w:t xml:space="preserve">9</w:t>
+            </w:r>
+          </w:p>
+        </w:tc>
+        <w:tc>
+          <w:tcPr>
+            <w:tcW w:type="dxa" w:w="3803"/>
+            <w:shd w:fill="FFFFFF" w:val="clear"/>
+            <w:tcMar>
+              <w:top w:type="dxa" w:w="70"/>
+              <w:left w:type="dxa" w:w="120"/>
+              <w:bottom w:type="dxa" w:w="70"/>
               <w:right w:type="dxa" w:w="120"/>
             </w:tcMar>
             <w:vAlign w:val="center"/>
@@ -383,12 +466,12 @@
         </w:trPr>
         <w:tc>
           <w:tcPr>
-            <w:tcW w:type="dxa" w:w="1600"/>
-            <w:shd w:fill="F7F7F5" w:val="clear"/>
-            <w:tcMar>
-              <w:top w:type="dxa" w:w="60"/>
-              <w:left w:type="dxa" w:w="120"/>
-              <w:bottom w:type="dxa" w:w="60"/>
+            <w:tcW w:type="dxa" w:w="1300"/>
+            <w:shd w:fill="F7F7F5" w:val="clear"/>
+            <w:tcMar>
+              <w:top w:type="dxa" w:w="70"/>
+              <w:left w:type="dxa" w:w="120"/>
+              <w:bottom w:type="dxa" w:w="70"/>
               <w:right w:type="dxa" w:w="120"/>
             </w:tcMar>
             <w:vAlign w:val="center"/>
@@ -406,12 +489,58 @@
         </w:tc>
         <w:tc>
           <w:tcPr>
-            <w:tcW w:type="dxa" w:w="8606"/>
-            <w:shd w:fill="F7F7F5" w:val="clear"/>
-            <w:tcMar>
-              <w:top w:type="dxa" w:w="60"/>
-              <w:left w:type="dxa" w:w="120"/>
-              <w:bottom w:type="dxa" w:w="60"/>
+            <w:tcW w:type="dxa" w:w="3803"/>
+            <w:shd w:fill="F7F7F5" w:val="clear"/>
+            <w:tcMar>
+              <w:top w:type="dxa" w:w="70"/>
+              <w:left w:type="dxa" w:w="120"/>
+              <w:bottom w:type="dxa" w:w="70"/>
+              <w:right w:type="dxa" w:w="120"/>
+            </w:tcMar>
+            <w:vAlign w:val="center"/>
+          </w:tcPr>
+          <w:p>
+            <w:r>
+              <w:rPr>
+                <w:color w:val="222222"/>
+                <w:sz w:val="20"/>
+                <w:szCs w:val="20"/>
+              </w:rPr>
+              <w:t xml:space="preserve">☐</w:t>
+            </w:r>
+          </w:p>
+        </w:tc>
+        <w:tc>
+          <w:tcPr>
+            <w:tcW w:type="dxa" w:w="1300"/>
+            <w:shd w:fill="F7F7F5" w:val="clear"/>
+            <w:tcMar>
+              <w:top w:type="dxa" w:w="70"/>
+              <w:left w:type="dxa" w:w="120"/>
+              <w:bottom w:type="dxa" w:w="70"/>
+              <w:right w:type="dxa" w:w="120"/>
+            </w:tcMar>
+            <w:vAlign w:val="center"/>
+          </w:tcPr>
+          <w:p>
+            <w:r>
+              <w:rPr>
+                <w:color w:val="666666"/>
+                <w:sz w:val="18"/>
+                <w:szCs w:val="18"/>
+              </w:rPr>
+              <w:t xml:space="preserve">10</w:t>
+            </w:r>
+          </w:p>
+        </w:tc>
+        <w:tc>
+          <w:tcPr>
+            <w:tcW w:type="dxa" w:w="3803"/>
+            <w:shd w:fill="F7F7F5" w:val="clear"/>
+            <w:tcMar>
+              <w:top w:type="dxa" w:w="70"/>
+              <w:left w:type="dxa" w:w="120"/>
+              <w:bottom w:type="dxa" w:w="70"/>
               <w:right w:type="dxa" w:w="120"/>
             </w:tcMar>
             <w:vAlign w:val="center"/>
@@ -434,12 +563,12 @@
         </w:trPr>
         <w:tc>
           <w:tcPr>
-            <w:tcW w:type="dxa" w:w="1600"/>
-            <w:shd w:fill="FFFFFF" w:val="clear"/>
-            <w:tcMar>
-              <w:top w:type="dxa" w:w="60"/>
-              <w:left w:type="dxa" w:w="120"/>
-              <w:bottom w:type="dxa" w:w="60"/>
+            <w:tcW w:type="dxa" w:w="1300"/>
+            <w:shd w:fill="FFFFFF" w:val="clear"/>
+            <w:tcMar>
+              <w:top w:type="dxa" w:w="70"/>
+              <w:left w:type="dxa" w:w="120"/>
+              <w:bottom w:type="dxa" w:w="70"/>
               <w:right w:type="dxa" w:w="120"/>
             </w:tcMar>
             <w:vAlign w:val="center"/>
@@ -457,12 +586,58 @@
         </w:tc>
         <w:tc>
           <w:tcPr>
-            <w:tcW w:type="dxa" w:w="8606"/>
-            <w:shd w:fill="FFFFFF" w:val="clear"/>
-            <w:tcMar>
-              <w:top w:type="dxa" w:w="60"/>
-              <w:left w:type="dxa" w:w="120"/>
-              <w:bottom w:type="dxa" w:w="60"/>
+            <w:tcW w:type="dxa" w:w="3803"/>
+            <w:shd w:fill="FFFFFF" w:val="clear"/>
+            <w:tcMar>
+              <w:top w:type="dxa" w:w="70"/>
+              <w:left w:type="dxa" w:w="120"/>
+              <w:bottom w:type="dxa" w:w="70"/>
+              <w:right w:type="dxa" w:w="120"/>
+            </w:tcMar>
+            <w:vAlign w:val="center"/>
+          </w:tcPr>
+          <w:p>
+            <w:r>
+              <w:rPr>
+                <w:color w:val="222222"/>
+                <w:sz w:val="20"/>
+                <w:szCs w:val="20"/>
+              </w:rPr>
+              <w:t xml:space="preserve">☐</w:t>
+            </w:r>
+          </w:p>
+        </w:tc>
+        <w:tc>
+          <w:tcPr>
+            <w:tcW w:type="dxa" w:w="1300"/>
+            <w:shd w:fill="FFFFFF" w:val="clear"/>
+            <w:tcMar>
+              <w:top w:type="dxa" w:w="70"/>
+              <w:left w:type="dxa" w:w="120"/>
+              <w:bottom w:type="dxa" w:w="70"/>
+              <w:right w:type="dxa" w:w="120"/>
+            </w:tcMar>
+            <w:vAlign w:val="center"/>
+          </w:tcPr>
+          <w:p>
+            <w:r>
+              <w:rPr>
+                <w:color w:val="666666"/>
+                <w:sz w:val="18"/>
+                <w:szCs w:val="18"/>
+              </w:rPr>
+              <w:t xml:space="preserve">11</w:t>
+            </w:r>
+          </w:p>
+        </w:tc>
+        <w:tc>
+          <w:tcPr>
+            <w:tcW w:type="dxa" w:w="3803"/>
+            <w:shd w:fill="FFFFFF" w:val="clear"/>
+            <w:tcMar>
+              <w:top w:type="dxa" w:w="70"/>
+              <w:left w:type="dxa" w:w="120"/>
+              <w:bottom w:type="dxa" w:w="70"/>
               <w:right w:type="dxa" w:w="120"/>
             </w:tcMar>
             <w:vAlign w:val="center"/>
@@ -485,12 +660,12 @@
         </w:trPr>
         <w:tc>
           <w:tcPr>
-            <w:tcW w:type="dxa" w:w="1600"/>
-            <w:shd w:fill="F7F7F5" w:val="clear"/>
-            <w:tcMar>
-              <w:top w:type="dxa" w:w="60"/>
-              <w:left w:type="dxa" w:w="120"/>
-              <w:bottom w:type="dxa" w:w="60"/>
+            <w:tcW w:type="dxa" w:w="1300"/>
+            <w:shd w:fill="F7F7F5" w:val="clear"/>
+            <w:tcMar>
+              <w:top w:type="dxa" w:w="70"/>
+              <w:left w:type="dxa" w:w="120"/>
+              <w:bottom w:type="dxa" w:w="70"/>
               <w:right w:type="dxa" w:w="120"/>
             </w:tcMar>
             <w:vAlign w:val="center"/>
@@ -508,12 +683,58 @@
         </w:tc>
         <w:tc>
           <w:tcPr>
-            <w:tcW w:type="dxa" w:w="8606"/>
-            <w:shd w:fill="F7F7F5" w:val="clear"/>
-            <w:tcMar>
-              <w:top w:type="dxa" w:w="60"/>
-              <w:left w:type="dxa" w:w="120"/>
-              <w:bottom w:type="dxa" w:w="60"/>
+            <w:tcW w:type="dxa" w:w="3803"/>
+            <w:shd w:fill="F7F7F5" w:val="clear"/>
+            <w:tcMar>
+              <w:top w:type="dxa" w:w="70"/>
+              <w:left w:type="dxa" w:w="120"/>
+              <w:bottom w:type="dxa" w:w="70"/>
+              <w:right w:type="dxa" w:w="120"/>
+            </w:tcMar>
+            <w:vAlign w:val="center"/>
+          </w:tcPr>
+          <w:p>
+            <w:r>
+              <w:rPr>
+                <w:color w:val="222222"/>
+                <w:sz w:val="20"/>
+                <w:szCs w:val="20"/>
+              </w:rPr>
+              <w:t xml:space="preserve">☐</w:t>
+            </w:r>
+          </w:p>
+        </w:tc>
+        <w:tc>
+          <w:tcPr>
+            <w:tcW w:type="dxa" w:w="1300"/>
+            <w:shd w:fill="F7F7F5" w:val="clear"/>
+            <w:tcMar>
+              <w:top w:type="dxa" w:w="70"/>
+              <w:left w:type="dxa" w:w="120"/>
+              <w:bottom w:type="dxa" w:w="70"/>
+              <w:right w:type="dxa" w:w="120"/>
+            </w:tcMar>
+            <w:vAlign w:val="center"/>
+          </w:tcPr>
+          <w:p>
+            <w:r>
+              <w:rPr>
+                <w:color w:val="666666"/>
+                <w:sz w:val="18"/>
+                <w:szCs w:val="18"/>
+              </w:rPr>
+              <w:t xml:space="preserve">12</w:t>
+            </w:r>
+          </w:p>
+        </w:tc>
+        <w:tc>
+          <w:tcPr>
+            <w:tcW w:type="dxa" w:w="3803"/>
+            <w:shd w:fill="F7F7F5" w:val="clear"/>
+            <w:tcMar>
+              <w:top w:type="dxa" w:w="70"/>
+              <w:left w:type="dxa" w:w="120"/>
+              <w:bottom w:type="dxa" w:w="70"/>
               <w:right w:type="dxa" w:w="120"/>
             </w:tcMar>
             <w:vAlign w:val="center"/>
@@ -536,12 +757,12 @@
         </w:trPr>
         <w:tc>
           <w:tcPr>
-            <w:tcW w:type="dxa" w:w="1600"/>
-            <w:shd w:fill="FFFFFF" w:val="clear"/>
-            <w:tcMar>
-              <w:top w:type="dxa" w:w="60"/>
-              <w:left w:type="dxa" w:w="120"/>
-              <w:bottom w:type="dxa" w:w="60"/>
+            <w:tcW w:type="dxa" w:w="1300"/>
+            <w:shd w:fill="FFFFFF" w:val="clear"/>
+            <w:tcMar>
+              <w:top w:type="dxa" w:w="70"/>
+              <w:left w:type="dxa" w:w="120"/>
+              <w:bottom w:type="dxa" w:w="70"/>
               <w:right w:type="dxa" w:w="120"/>
             </w:tcMar>
             <w:vAlign w:val="center"/>
@@ -559,12 +780,58 @@
         </w:tc>
         <w:tc>
           <w:tcPr>
-            <w:tcW w:type="dxa" w:w="8606"/>
-            <w:shd w:fill="FFFFFF" w:val="clear"/>
-            <w:tcMar>
-              <w:top w:type="dxa" w:w="60"/>
-              <w:left w:type="dxa" w:w="120"/>
-              <w:bottom w:type="dxa" w:w="60"/>
+            <w:tcW w:type="dxa" w:w="3803"/>
+            <w:shd w:fill="FFFFFF" w:val="clear"/>
+            <w:tcMar>
+              <w:top w:type="dxa" w:w="70"/>
+              <w:left w:type="dxa" w:w="120"/>
+              <w:bottom w:type="dxa" w:w="70"/>
+              <w:right w:type="dxa" w:w="120"/>
+            </w:tcMar>
+            <w:vAlign w:val="center"/>
+          </w:tcPr>
+          <w:p>
+            <w:r>
+              <w:rPr>
+                <w:color w:val="222222"/>
+                <w:sz w:val="20"/>
+                <w:szCs w:val="20"/>
+              </w:rPr>
+              <w:t xml:space="preserve">☐</w:t>
+            </w:r>
+          </w:p>
+        </w:tc>
+        <w:tc>
+          <w:tcPr>
+            <w:tcW w:type="dxa" w:w="1300"/>
+            <w:shd w:fill="FFFFFF" w:val="clear"/>
+            <w:tcMar>
+              <w:top w:type="dxa" w:w="70"/>
+              <w:left w:type="dxa" w:w="120"/>
+              <w:bottom w:type="dxa" w:w="70"/>
+              <w:right w:type="dxa" w:w="120"/>
+            </w:tcMar>
+            <w:vAlign w:val="center"/>
+          </w:tcPr>
+          <w:p>
+            <w:r>
+              <w:rPr>
+                <w:color w:val="666666"/>
+                <w:sz w:val="18"/>
+                <w:szCs w:val="18"/>
+              </w:rPr>
+              <w:t xml:space="preserve">13</w:t>
+            </w:r>
+          </w:p>
+        </w:tc>
+        <w:tc>
+          <w:tcPr>
+            <w:tcW w:type="dxa" w:w="3803"/>
+            <w:shd w:fill="FFFFFF" w:val="clear"/>
+            <w:tcMar>
+              <w:top w:type="dxa" w:w="70"/>
+              <w:left w:type="dxa" w:w="120"/>
+              <w:bottom w:type="dxa" w:w="70"/>
               <w:right w:type="dxa" w:w="120"/>
             </w:tcMar>
             <w:vAlign w:val="center"/>
@@ -587,12 +854,12 @@
         </w:trPr>
         <w:tc>
           <w:tcPr>
-            <w:tcW w:type="dxa" w:w="1600"/>
-            <w:shd w:fill="F7F7F5" w:val="clear"/>
-            <w:tcMar>
-              <w:top w:type="dxa" w:w="60"/>
-              <w:left w:type="dxa" w:w="120"/>
-              <w:bottom w:type="dxa" w:w="60"/>
+            <w:tcW w:type="dxa" w:w="1300"/>
+            <w:shd w:fill="F7F7F5" w:val="clear"/>
+            <w:tcMar>
+              <w:top w:type="dxa" w:w="70"/>
+              <w:left w:type="dxa" w:w="120"/>
+              <w:bottom w:type="dxa" w:w="70"/>
               <w:right w:type="dxa" w:w="120"/>
             </w:tcMar>
             <w:vAlign w:val="center"/>
@@ -610,12 +877,58 @@
         </w:tc>
         <w:tc>
           <w:tcPr>
-            <w:tcW w:type="dxa" w:w="8606"/>
-            <w:shd w:fill="F7F7F5" w:val="clear"/>
-            <w:tcMar>
-              <w:top w:type="dxa" w:w="60"/>
-              <w:left w:type="dxa" w:w="120"/>
-              <w:bottom w:type="dxa" w:w="60"/>
+            <w:tcW w:type="dxa" w:w="3803"/>
+            <w:shd w:fill="F7F7F5" w:val="clear"/>
+            <w:tcMar>
+              <w:top w:type="dxa" w:w="70"/>
+              <w:left w:type="dxa" w:w="120"/>
+              <w:bottom w:type="dxa" w:w="70"/>
+              <w:right w:type="dxa" w:w="120"/>
+            </w:tcMar>
+            <w:vAlign w:val="center"/>
+          </w:tcPr>
+          <w:p>
+            <w:r>
+              <w:rPr>
+                <w:color w:val="222222"/>
+                <w:sz w:val="20"/>
+                <w:szCs w:val="20"/>
+              </w:rPr>
+              <w:t xml:space="preserve">☐</w:t>
+            </w:r>
+          </w:p>
+        </w:tc>
+        <w:tc>
+          <w:tcPr>
+            <w:tcW w:type="dxa" w:w="1300"/>
+            <w:shd w:fill="F7F7F5" w:val="clear"/>
+            <w:tcMar>
+              <w:top w:type="dxa" w:w="70"/>
+              <w:left w:type="dxa" w:w="120"/>
+              <w:bottom w:type="dxa" w:w="70"/>
+              <w:right w:type="dxa" w:w="120"/>
+            </w:tcMar>
+            <w:vAlign w:val="center"/>
+          </w:tcPr>
+          <w:p>
+            <w:r>
+              <w:rPr>
+                <w:color w:val="666666"/>
+                <w:sz w:val="18"/>
+                <w:szCs w:val="18"/>
+              </w:rPr>
+              <w:t xml:space="preserve">14</w:t>
+            </w:r>
+          </w:p>
+        </w:tc>
+        <w:tc>
+          <w:tcPr>
+            <w:tcW w:type="dxa" w:w="3803"/>
+            <w:shd w:fill="F7F7F5" w:val="clear"/>
+            <w:tcMar>
+              <w:top w:type="dxa" w:w="70"/>
+              <w:left w:type="dxa" w:w="120"/>
+              <w:bottom w:type="dxa" w:w="70"/>
               <w:right w:type="dxa" w:w="120"/>
             </w:tcMar>
             <w:vAlign w:val="center"/>
@@ -638,12 +951,12 @@
         </w:trPr>
         <w:tc>
           <w:tcPr>
-            <w:tcW w:type="dxa" w:w="1600"/>
-            <w:shd w:fill="FFFFFF" w:val="clear"/>
-            <w:tcMar>
-              <w:top w:type="dxa" w:w="60"/>
-              <w:left w:type="dxa" w:w="120"/>
-              <w:bottom w:type="dxa" w:w="60"/>
+            <w:tcW w:type="dxa" w:w="1300"/>
+            <w:shd w:fill="FFFFFF" w:val="clear"/>
+            <w:tcMar>
+              <w:top w:type="dxa" w:w="70"/>
+              <w:left w:type="dxa" w:w="120"/>
+              <w:bottom w:type="dxa" w:w="70"/>
               <w:right w:type="dxa" w:w="120"/>
             </w:tcMar>
             <w:vAlign w:val="center"/>
@@ -661,12 +974,58 @@
         </w:tc>
         <w:tc>
           <w:tcPr>
-            <w:tcW w:type="dxa" w:w="8606"/>
-            <w:shd w:fill="FFFFFF" w:val="clear"/>
-            <w:tcMar>
-              <w:top w:type="dxa" w:w="60"/>
-              <w:left w:type="dxa" w:w="120"/>
-              <w:bottom w:type="dxa" w:w="60"/>
+            <w:tcW w:type="dxa" w:w="3803"/>
+            <w:shd w:fill="FFFFFF" w:val="clear"/>
+            <w:tcMar>
+              <w:top w:type="dxa" w:w="70"/>
+              <w:left w:type="dxa" w:w="120"/>
+              <w:bottom w:type="dxa" w:w="70"/>
+              <w:right w:type="dxa" w:w="120"/>
+            </w:tcMar>
+            <w:vAlign w:val="center"/>
+          </w:tcPr>
+          <w:p>
+            <w:r>
+              <w:rPr>
+                <w:color w:val="222222"/>
+                <w:sz w:val="20"/>
+                <w:szCs w:val="20"/>
+              </w:rPr>
+              <w:t xml:space="preserve">☐</w:t>
+            </w:r>
+          </w:p>
+        </w:tc>
+        <w:tc>
+          <w:tcPr>
+            <w:tcW w:type="dxa" w:w="1300"/>
+            <w:shd w:fill="FFFFFF" w:val="clear"/>
+            <w:tcMar>
+              <w:top w:type="dxa" w:w="70"/>
+              <w:left w:type="dxa" w:w="120"/>
+              <w:bottom w:type="dxa" w:w="70"/>
+              <w:right w:type="dxa" w:w="120"/>
+            </w:tcMar>
+            <w:vAlign w:val="center"/>
+          </w:tcPr>
+          <w:p>
+            <w:r>
+              <w:rPr>
+                <w:color w:val="666666"/>
+                <w:sz w:val="18"/>
+                <w:szCs w:val="18"/>
+              </w:rPr>
+              <w:t xml:space="preserve">15</w:t>
+            </w:r>
+          </w:p>
+        </w:tc>
+        <w:tc>
+          <w:tcPr>
+            <w:tcW w:type="dxa" w:w="3803"/>
+            <w:shd w:fill="FFFFFF" w:val="clear"/>
+            <w:tcMar>
+              <w:top w:type="dxa" w:w="70"/>
+              <w:left w:type="dxa" w:w="120"/>
+              <w:bottom w:type="dxa" w:w="70"/>
               <w:right w:type="dxa" w:w="120"/>
             </w:tcMar>
             <w:vAlign w:val="center"/>
@@ -689,12 +1048,12 @@
         </w:trPr>
         <w:tc>
           <w:tcPr>
-            <w:tcW w:type="dxa" w:w="1600"/>
-            <w:shd w:fill="F7F7F5" w:val="clear"/>
-            <w:tcMar>
-              <w:top w:type="dxa" w:w="60"/>
-              <w:left w:type="dxa" w:w="120"/>
-              <w:bottom w:type="dxa" w:w="60"/>
+            <w:tcW w:type="dxa" w:w="1300"/>
+            <w:shd w:fill="F7F7F5" w:val="clear"/>
+            <w:tcMar>
+              <w:top w:type="dxa" w:w="70"/>
+              <w:left w:type="dxa" w:w="120"/>
+              <w:bottom w:type="dxa" w:w="70"/>
               <w:right w:type="dxa" w:w="120"/>
             </w:tcMar>
             <w:vAlign w:val="center"/>
@@ -712,397 +1071,35 @@
         </w:tc>
         <w:tc>
           <w:tcPr>
-            <w:tcW w:type="dxa" w:w="8606"/>
-            <w:shd w:fill="F7F7F5" w:val="clear"/>
-            <w:tcMar>
-              <w:top w:type="dxa" w:w="60"/>
-              <w:left w:type="dxa" w:w="120"/>
-              <w:bottom w:type="dxa" w:w="60"/>
-              <w:right w:type="dxa" w:w="120"/>
-            </w:tcMar>
-            <w:vAlign w:val="center"/>
-          </w:tcPr>
-          <w:p>
-            <w:r>
-              <w:rPr>
-                <w:color w:val="222222"/>
-                <w:sz w:val="20"/>
-                <w:szCs w:val="20"/>
-              </w:rPr>
-              <w:t xml:space="preserve">☐</w:t>
-            </w:r>
-          </w:p>
-        </w:tc>
-      </w:tr>
-      <w:tr>
-        <w:trPr>
-          <w:cantSplit/>
-        </w:trPr>
-        <w:tc>
-          <w:tcPr>
-            <w:tcW w:type="dxa" w:w="1600"/>
-            <w:shd w:fill="FFFFFF" w:val="clear"/>
-            <w:tcMar>
-              <w:top w:type="dxa" w:w="60"/>
-              <w:left w:type="dxa" w:w="120"/>
-              <w:bottom w:type="dxa" w:w="60"/>
-              <w:right w:type="dxa" w:w="120"/>
-            </w:tcMar>
-            <w:vAlign w:val="center"/>
-          </w:tcPr>
-          <w:p>
-            <w:r>
-              <w:rPr>
-                <w:color w:val="666666"/>
-                <w:sz w:val="18"/>
-                <w:szCs w:val="18"/>
-              </w:rPr>
-              <w:t xml:space="preserve">9</w:t>
-            </w:r>
-          </w:p>
-        </w:tc>
-        <w:tc>
-          <w:tcPr>
-            <w:tcW w:type="dxa" w:w="8606"/>
-            <w:shd w:fill="FFFFFF" w:val="clear"/>
-            <w:tcMar>
-              <w:top w:type="dxa" w:w="60"/>
-              <w:left w:type="dxa" w:w="120"/>
-              <w:bottom w:type="dxa" w:w="60"/>
-              <w:right w:type="dxa" w:w="120"/>
-            </w:tcMar>
-            <w:vAlign w:val="center"/>
-          </w:tcPr>
-          <w:p>
-            <w:r>
-              <w:rPr>
-                <w:color w:val="222222"/>
-                <w:sz w:val="20"/>
-                <w:szCs w:val="20"/>
-              </w:rPr>
-              <w:t xml:space="preserve">☐</w:t>
-            </w:r>
-          </w:p>
-        </w:tc>
-      </w:tr>
-      <w:tr>
-        <w:trPr>
-          <w:cantSplit/>
-        </w:trPr>
-        <w:tc>
-          <w:tcPr>
-            <w:tcW w:type="dxa" w:w="1600"/>
-            <w:shd w:fill="F7F7F5" w:val="clear"/>
-            <w:tcMar>
-              <w:top w:type="dxa" w:w="60"/>
-              <w:left w:type="dxa" w:w="120"/>
-              <w:bottom w:type="dxa" w:w="60"/>
-              <w:right w:type="dxa" w:w="120"/>
-            </w:tcMar>
-            <w:vAlign w:val="center"/>
-          </w:tcPr>
-          <w:p>
-            <w:r>
-              <w:rPr>
-                <w:color w:val="666666"/>
-                <w:sz w:val="18"/>
-                <w:szCs w:val="18"/>
-              </w:rPr>
-              <w:t xml:space="preserve">10</w:t>
-            </w:r>
-          </w:p>
-        </w:tc>
-        <w:tc>
-          <w:tcPr>
-            <w:tcW w:type="dxa" w:w="8606"/>
-            <w:shd w:fill="F7F7F5" w:val="clear"/>
-            <w:tcMar>
-              <w:top w:type="dxa" w:w="60"/>
-              <w:left w:type="dxa" w:w="120"/>
-              <w:bottom w:type="dxa" w:w="60"/>
-              <w:right w:type="dxa" w:w="120"/>
-            </w:tcMar>
-            <w:vAlign w:val="center"/>
-          </w:tcPr>
-          <w:p>
-            <w:r>
-              <w:rPr>
-                <w:color w:val="222222"/>
-                <w:sz w:val="20"/>
-                <w:szCs w:val="20"/>
-              </w:rPr>
-              <w:t xml:space="preserve">☐</w:t>
-            </w:r>
-          </w:p>
-        </w:tc>
-      </w:tr>
-      <w:tr>
-        <w:trPr>
-          <w:cantSplit/>
-        </w:trPr>
-        <w:tc>
-          <w:tcPr>
-            <w:tcW w:type="dxa" w:w="1600"/>
-            <w:shd w:fill="FFFFFF" w:val="clear"/>
-            <w:tcMar>
-              <w:top w:type="dxa" w:w="60"/>
-              <w:left w:type="dxa" w:w="120"/>
-              <w:bottom w:type="dxa" w:w="60"/>
-              <w:right w:type="dxa" w:w="120"/>
-            </w:tcMar>
-            <w:vAlign w:val="center"/>
-          </w:tcPr>
-          <w:p>
-            <w:r>
-              <w:rPr>
-                <w:color w:val="666666"/>
-                <w:sz w:val="18"/>
-                <w:szCs w:val="18"/>
-              </w:rPr>
-              <w:t xml:space="preserve">11</w:t>
-            </w:r>
-          </w:p>
-        </w:tc>
-        <w:tc>
-          <w:tcPr>
-            <w:tcW w:type="dxa" w:w="8606"/>
-            <w:shd w:fill="FFFFFF" w:val="clear"/>
-            <w:tcMar>
-              <w:top w:type="dxa" w:w="60"/>
-              <w:left w:type="dxa" w:w="120"/>
-              <w:bottom w:type="dxa" w:w="60"/>
-              <w:right w:type="dxa" w:w="120"/>
-            </w:tcMar>
-            <w:vAlign w:val="center"/>
-          </w:tcPr>
-          <w:p>
-            <w:r>
-              <w:rPr>
-                <w:color w:val="222222"/>
-                <w:sz w:val="20"/>
-                <w:szCs w:val="20"/>
-              </w:rPr>
-              <w:t xml:space="preserve">☐</w:t>
-            </w:r>
-          </w:p>
-        </w:tc>
-      </w:tr>
-      <w:tr>
-        <w:trPr>
-          <w:cantSplit/>
-        </w:trPr>
-        <w:tc>
-          <w:tcPr>
-            <w:tcW w:type="dxa" w:w="1600"/>
-            <w:shd w:fill="F7F7F5" w:val="clear"/>
-            <w:tcMar>
-              <w:top w:type="dxa" w:w="60"/>
-              <w:left w:type="dxa" w:w="120"/>
-              <w:bottom w:type="dxa" w:w="60"/>
-              <w:right w:type="dxa" w:w="120"/>
-            </w:tcMar>
-            <w:vAlign w:val="center"/>
-          </w:tcPr>
-          <w:p>
-            <w:r>
-              <w:rPr>
-                <w:color w:val="666666"/>
-                <w:sz w:val="18"/>
-                <w:szCs w:val="18"/>
-              </w:rPr>
-              <w:t xml:space="preserve">12</w:t>
-            </w:r>
-          </w:p>
-        </w:tc>
-        <w:tc>
-          <w:tcPr>
-            <w:tcW w:type="dxa" w:w="8606"/>
-            <w:shd w:fill="F7F7F5" w:val="clear"/>
-            <w:tcMar>
-              <w:top w:type="dxa" w:w="60"/>
-              <w:left w:type="dxa" w:w="120"/>
-              <w:bottom w:type="dxa" w:w="60"/>
-              <w:right w:type="dxa" w:w="120"/>
-            </w:tcMar>
-            <w:vAlign w:val="center"/>
-          </w:tcPr>
-          <w:p>
-            <w:r>
-              <w:rPr>
-                <w:color w:val="222222"/>
-                <w:sz w:val="20"/>
-                <w:szCs w:val="20"/>
-              </w:rPr>
-              <w:t xml:space="preserve">☐</w:t>
-            </w:r>
-          </w:p>
-        </w:tc>
-      </w:tr>
-      <w:tr>
-        <w:trPr>
-          <w:cantSplit/>
-        </w:trPr>
-        <w:tc>
-          <w:tcPr>
-            <w:tcW w:type="dxa" w:w="1600"/>
-            <w:shd w:fill="FFFFFF" w:val="clear"/>
-            <w:tcMar>
-              <w:top w:type="dxa" w:w="60"/>
-              <w:left w:type="dxa" w:w="120"/>
-              <w:bottom w:type="dxa" w:w="60"/>
-              <w:right w:type="dxa" w:w="120"/>
-            </w:tcMar>
-            <w:vAlign w:val="center"/>
-          </w:tcPr>
-          <w:p>
-            <w:r>
-              <w:rPr>
-                <w:color w:val="666666"/>
-                <w:sz w:val="18"/>
-                <w:szCs w:val="18"/>
-              </w:rPr>
-              <w:t xml:space="preserve">13</w:t>
-            </w:r>
-          </w:p>
-        </w:tc>
-        <w:tc>
-          <w:tcPr>
-            <w:tcW w:type="dxa" w:w="8606"/>
-            <w:shd w:fill="FFFFFF" w:val="clear"/>
-            <w:tcMar>
-              <w:top w:type="dxa" w:w="60"/>
-              <w:left w:type="dxa" w:w="120"/>
-              <w:bottom w:type="dxa" w:w="60"/>
-              <w:right w:type="dxa" w:w="120"/>
-            </w:tcMar>
-            <w:vAlign w:val="center"/>
-          </w:tcPr>
-          <w:p>
-            <w:r>
-              <w:rPr>
-                <w:color w:val="222222"/>
-                <w:sz w:val="20"/>
-                <w:szCs w:val="20"/>
-              </w:rPr>
-              <w:t xml:space="preserve">☐</w:t>
-            </w:r>
-          </w:p>
-        </w:tc>
-      </w:tr>
-      <w:tr>
-        <w:trPr>
-          <w:cantSplit/>
-        </w:trPr>
-        <w:tc>
-          <w:tcPr>
-            <w:tcW w:type="dxa" w:w="1600"/>
-            <w:shd w:fill="F7F7F5" w:val="clear"/>
-            <w:tcMar>
-              <w:top w:type="dxa" w:w="60"/>
-              <w:left w:type="dxa" w:w="120"/>
-              <w:bottom w:type="dxa" w:w="60"/>
-              <w:right w:type="dxa" w:w="120"/>
-            </w:tcMar>
-            <w:vAlign w:val="center"/>
-          </w:tcPr>
-          <w:p>
-            <w:r>
-              <w:rPr>
-                <w:color w:val="666666"/>
-                <w:sz w:val="18"/>
-                <w:szCs w:val="18"/>
-              </w:rPr>
-              <w:t xml:space="preserve">14</w:t>
-            </w:r>
-          </w:p>
-        </w:tc>
-        <w:tc>
-          <w:tcPr>
-            <w:tcW w:type="dxa" w:w="8606"/>
-            <w:shd w:fill="F7F7F5" w:val="clear"/>
-            <w:tcMar>
-              <w:top w:type="dxa" w:w="60"/>
-              <w:left w:type="dxa" w:w="120"/>
-              <w:bottom w:type="dxa" w:w="60"/>
-              <w:right w:type="dxa" w:w="120"/>
-            </w:tcMar>
-            <w:vAlign w:val="center"/>
-          </w:tcPr>
-          <w:p>
-            <w:r>
-              <w:rPr>
-                <w:color w:val="222222"/>
-                <w:sz w:val="20"/>
-                <w:szCs w:val="20"/>
-              </w:rPr>
-              <w:t xml:space="preserve">☐</w:t>
-            </w:r>
-          </w:p>
-        </w:tc>
-      </w:tr>
-      <w:tr>
-        <w:trPr>
-          <w:cantSplit/>
-        </w:trPr>
-        <w:tc>
-          <w:tcPr>
-            <w:tcW w:type="dxa" w:w="1600"/>
-            <w:shd w:fill="FFFFFF" w:val="clear"/>
-            <w:tcMar>
-              <w:top w:type="dxa" w:w="60"/>
-              <w:left w:type="dxa" w:w="120"/>
-              <w:bottom w:type="dxa" w:w="60"/>
-              <w:right w:type="dxa" w:w="120"/>
-            </w:tcMar>
-            <w:vAlign w:val="center"/>
-          </w:tcPr>
-          <w:p>
-            <w:r>
-              <w:rPr>
-                <w:color w:val="666666"/>
-                <w:sz w:val="18"/>
-                <w:szCs w:val="18"/>
-              </w:rPr>
-              <w:t xml:space="preserve">15</w:t>
-            </w:r>
-          </w:p>
-        </w:tc>
-        <w:tc>
-          <w:tcPr>
-            <w:tcW w:type="dxa" w:w="8606"/>
-            <w:shd w:fill="FFFFFF" w:val="clear"/>
-            <w:tcMar>
-              <w:top w:type="dxa" w:w="60"/>
-              <w:left w:type="dxa" w:w="120"/>
-              <w:bottom w:type="dxa" w:w="60"/>
-              <w:right w:type="dxa" w:w="120"/>
-            </w:tcMar>
-            <w:vAlign w:val="center"/>
-          </w:tcPr>
-          <w:p>
-            <w:r>
-              <w:rPr>
-                <w:color w:val="222222"/>
-                <w:sz w:val="20"/>
-                <w:szCs w:val="20"/>
-              </w:rPr>
-              <w:t xml:space="preserve">☐</w:t>
-            </w:r>
-          </w:p>
-        </w:tc>
-      </w:tr>
-      <w:tr>
-        <w:trPr>
-          <w:cantSplit/>
-        </w:trPr>
-        <w:tc>
-          <w:tcPr>
-            <w:tcW w:type="dxa" w:w="1600"/>
-            <w:shd w:fill="F7F7F5" w:val="clear"/>
-            <w:tcMar>
-              <w:top w:type="dxa" w:w="60"/>
-              <w:left w:type="dxa" w:w="120"/>
-              <w:bottom w:type="dxa" w:w="60"/>
+            <w:tcW w:type="dxa" w:w="3803"/>
+            <w:shd w:fill="F7F7F5" w:val="clear"/>
+            <w:tcMar>
+              <w:top w:type="dxa" w:w="70"/>
+              <w:left w:type="dxa" w:w="120"/>
+              <w:bottom w:type="dxa" w:w="70"/>
+              <w:right w:type="dxa" w:w="120"/>
+            </w:tcMar>
+            <w:vAlign w:val="center"/>
+          </w:tcPr>
+          <w:p>
+            <w:r>
+              <w:rPr>
+                <w:color w:val="222222"/>
+                <w:sz w:val="20"/>
+                <w:szCs w:val="20"/>
+              </w:rPr>
+              <w:t xml:space="preserve">☐</w:t>
+            </w:r>
+          </w:p>
+        </w:tc>
+        <w:tc>
+          <w:tcPr>
+            <w:tcW w:type="dxa" w:w="1300"/>
+            <w:shd w:fill="F7F7F5" w:val="clear"/>
+            <w:tcMar>
+              <w:top w:type="dxa" w:w="70"/>
+              <w:left w:type="dxa" w:w="120"/>
+              <w:bottom w:type="dxa" w:w="70"/>
               <w:right w:type="dxa" w:w="120"/>
             </w:tcMar>
             <w:vAlign w:val="center"/>
@@ -1120,12 +1117,12 @@
         </w:tc>
         <w:tc>
           <w:tcPr>
-            <w:tcW w:type="dxa" w:w="8606"/>
-            <w:shd w:fill="F7F7F5" w:val="clear"/>
-            <w:tcMar>
-              <w:top w:type="dxa" w:w="60"/>
-              <w:left w:type="dxa" w:w="120"/>
-              <w:bottom w:type="dxa" w:w="60"/>
+            <w:tcW w:type="dxa" w:w="3803"/>
+            <w:shd w:fill="F7F7F5" w:val="clear"/>
+            <w:tcMar>
+              <w:top w:type="dxa" w:w="70"/>
+              <w:left w:type="dxa" w:w="120"/>
+              <w:bottom w:type="dxa" w:w="70"/>
               <w:right w:type="dxa" w:w="120"/>
             </w:tcMar>
             <w:vAlign w:val="center"/>
@@ -1312,23 +1309,8 @@
     </w:tbl>
     <w:p>
       <w:pPr>
-        <w:spacing w:after="160"/>
-      </w:pPr>
-    </w:p>
-    <w:p>
-      <w:pPr>
         <w:spacing w:after="240"/>
       </w:pPr>
-      <w:r>
-        <w:rPr>
-          <w:i/>
-          <w:iCs/>
-          <w:color w:val="666666"/>
-          <w:sz w:val="19"/>
-          <w:szCs w:val="19"/>
-        </w:rPr>
-        <w:t xml:space="preserve">Jungscharlager „Jo und die starken 7“ · Montag, 17.08.2026 · mittags</w:t>
-      </w:r>
     </w:p>
     <w:p>
       <w:pPr>
@@ -1517,8 +1499,10 @@
         </w:tblBorders>
       </w:tblPr>
       <w:tblGrid>
-        <w:gridCol w:w="1600"/>
-        <w:gridCol w:w="8606"/>
+        <w:gridCol w:w="1300"/>
+        <w:gridCol w:w="3803"/>
+        <w:gridCol w:w="1300"/>
+        <w:gridCol w:w="3803"/>
       </w:tblGrid>
       <w:tr>
         <w:trPr>
@@ -1526,7 +1510,7 @@
         </w:trPr>
         <w:tc>
           <w:tcPr>
-            <w:tcW w:type="dxa" w:w="1600"/>
+            <w:tcW w:type="dxa" w:w="1300"/>
             <w:shd w:fill="1F3B4D" w:val="clear"/>
             <w:tcMar>
               <w:top w:type="dxa" w:w="100"/>
@@ -1551,7 +1535,57 @@
         </w:tc>
         <w:tc>
           <w:tcPr>
-            <w:tcW w:type="dxa" w:w="8606"/>
+            <w:tcW w:type="dxa" w:w="3803"/>
+            <w:shd w:fill="1F3B4D" w:val="clear"/>
+            <w:tcMar>
+              <w:top w:type="dxa" w:w="100"/>
+              <w:left w:type="dxa" w:w="120"/>
+              <w:bottom w:type="dxa" w:w="100"/>
+              <w:right w:type="dxa" w:w="120"/>
+            </w:tcMar>
+            <w:vAlign w:val="center"/>
+          </w:tcPr>
+          <w:p>
+            <w:r>
+              <w:rPr>
+                <w:b/>
+                <w:bCs/>
+                <w:color w:val="FFFFFF"/>
+                <w:sz w:val="18"/>
+                <w:szCs w:val="18"/>
+              </w:rPr>
+              <w:t xml:space="preserve">Punkt</w:t>
+            </w:r>
+          </w:p>
+        </w:tc>
+        <w:tc>
+          <w:tcPr>
+            <w:tcW w:type="dxa" w:w="1300"/>
+            <w:shd w:fill="1F3B4D" w:val="clear"/>
+            <w:tcMar>
+              <w:top w:type="dxa" w:w="100"/>
+              <w:left w:type="dxa" w:w="120"/>
+              <w:bottom w:type="dxa" w:w="100"/>
+              <w:right w:type="dxa" w:w="120"/>
+            </w:tcMar>
+            <w:vAlign w:val="center"/>
+          </w:tcPr>
+          <w:p>
+            <w:r>
+              <w:rPr>
+                <w:b/>
+                <w:bCs/>
+                <w:color w:val="FFFFFF"/>
+                <w:sz w:val="18"/>
+                <w:szCs w:val="18"/>
+              </w:rPr>
+              <w:t xml:space="preserve">Nr.</w:t>
+            </w:r>
+          </w:p>
+        </w:tc>
+        <w:tc>
+          <w:tcPr>
+            <w:tcW w:type="dxa" w:w="3803"/>
             <w:shd w:fill="1F3B4D" w:val="clear"/>
             <w:tcMar>
               <w:top w:type="dxa" w:w="100"/>
@@ -1581,12 +1615,12 @@
         </w:trPr>
         <w:tc>
           <w:tcPr>
-            <w:tcW w:type="dxa" w:w="1600"/>
-            <w:shd w:fill="FFFFFF" w:val="clear"/>
-            <w:tcMar>
-              <w:top w:type="dxa" w:w="60"/>
-              <w:left w:type="dxa" w:w="120"/>
-              <w:bottom w:type="dxa" w:w="60"/>
+            <w:tcW w:type="dxa" w:w="1300"/>
+            <w:shd w:fill="FFFFFF" w:val="clear"/>
+            <w:tcMar>
+              <w:top w:type="dxa" w:w="70"/>
+              <w:left w:type="dxa" w:w="120"/>
+              <w:bottom w:type="dxa" w:w="70"/>
               <w:right w:type="dxa" w:w="120"/>
             </w:tcMar>
             <w:vAlign w:val="center"/>
@@ -1604,12 +1638,58 @@
         </w:tc>
         <w:tc>
           <w:tcPr>
-            <w:tcW w:type="dxa" w:w="8606"/>
-            <w:shd w:fill="FFFFFF" w:val="clear"/>
-            <w:tcMar>
-              <w:top w:type="dxa" w:w="60"/>
-              <w:left w:type="dxa" w:w="120"/>
-              <w:bottom w:type="dxa" w:w="60"/>
+            <w:tcW w:type="dxa" w:w="3803"/>
+            <w:shd w:fill="FFFFFF" w:val="clear"/>
+            <w:tcMar>
+              <w:top w:type="dxa" w:w="70"/>
+              <w:left w:type="dxa" w:w="120"/>
+              <w:bottom w:type="dxa" w:w="70"/>
+              <w:right w:type="dxa" w:w="120"/>
+            </w:tcMar>
+            <w:vAlign w:val="center"/>
+          </w:tcPr>
+          <w:p>
+            <w:r>
+              <w:rPr>
+                <w:color w:val="222222"/>
+                <w:sz w:val="20"/>
+                <w:szCs w:val="20"/>
+              </w:rPr>
+              <w:t xml:space="preserve">☐</w:t>
+            </w:r>
+          </w:p>
+        </w:tc>
+        <w:tc>
+          <w:tcPr>
+            <w:tcW w:type="dxa" w:w="1300"/>
+            <w:shd w:fill="FFFFFF" w:val="clear"/>
+            <w:tcMar>
+              <w:top w:type="dxa" w:w="70"/>
+              <w:left w:type="dxa" w:w="120"/>
+              <w:bottom w:type="dxa" w:w="70"/>
+              <w:right w:type="dxa" w:w="120"/>
+            </w:tcMar>
+            <w:vAlign w:val="center"/>
+          </w:tcPr>
+          <w:p>
+            <w:r>
+              <w:rPr>
+                <w:color w:val="666666"/>
+                <w:sz w:val="18"/>
+                <w:szCs w:val="18"/>
+              </w:rPr>
+              <w:t xml:space="preserve">9</w:t>
+            </w:r>
+          </w:p>
+        </w:tc>
+        <w:tc>
+          <w:tcPr>
+            <w:tcW w:type="dxa" w:w="3803"/>
+            <w:shd w:fill="FFFFFF" w:val="clear"/>
+            <w:tcMar>
+              <w:top w:type="dxa" w:w="70"/>
+              <w:left w:type="dxa" w:w="120"/>
+              <w:bottom w:type="dxa" w:w="70"/>
               <w:right w:type="dxa" w:w="120"/>
             </w:tcMar>
             <w:vAlign w:val="center"/>
@@ -1632,12 +1712,12 @@
         </w:trPr>
         <w:tc>
           <w:tcPr>
-            <w:tcW w:type="dxa" w:w="1600"/>
-            <w:shd w:fill="F7F7F5" w:val="clear"/>
-            <w:tcMar>
-              <w:top w:type="dxa" w:w="60"/>
-              <w:left w:type="dxa" w:w="120"/>
-              <w:bottom w:type="dxa" w:w="60"/>
+            <w:tcW w:type="dxa" w:w="1300"/>
+            <w:shd w:fill="F7F7F5" w:val="clear"/>
+            <w:tcMar>
+              <w:top w:type="dxa" w:w="70"/>
+              <w:left w:type="dxa" w:w="120"/>
+              <w:bottom w:type="dxa" w:w="70"/>
               <w:right w:type="dxa" w:w="120"/>
             </w:tcMar>
             <w:vAlign w:val="center"/>
@@ -1655,12 +1735,58 @@
         </w:tc>
         <w:tc>
           <w:tcPr>
-            <w:tcW w:type="dxa" w:w="8606"/>
-            <w:shd w:fill="F7F7F5" w:val="clear"/>
-            <w:tcMar>
-              <w:top w:type="dxa" w:w="60"/>
-              <w:left w:type="dxa" w:w="120"/>
-              <w:bottom w:type="dxa" w:w="60"/>
+            <w:tcW w:type="dxa" w:w="3803"/>
+            <w:shd w:fill="F7F7F5" w:val="clear"/>
+            <w:tcMar>
+              <w:top w:type="dxa" w:w="70"/>
+              <w:left w:type="dxa" w:w="120"/>
+              <w:bottom w:type="dxa" w:w="70"/>
+              <w:right w:type="dxa" w:w="120"/>
+            </w:tcMar>
+            <w:vAlign w:val="center"/>
+          </w:tcPr>
+          <w:p>
+            <w:r>
+              <w:rPr>
+                <w:color w:val="222222"/>
+                <w:sz w:val="20"/>
+                <w:szCs w:val="20"/>
+              </w:rPr>
+              <w:t xml:space="preserve">☐</w:t>
+            </w:r>
+          </w:p>
+        </w:tc>
+        <w:tc>
+          <w:tcPr>
+            <w:tcW w:type="dxa" w:w="1300"/>
+            <w:shd w:fill="F7F7F5" w:val="clear"/>
+            <w:tcMar>
+              <w:top w:type="dxa" w:w="70"/>
+              <w:left w:type="dxa" w:w="120"/>
+              <w:bottom w:type="dxa" w:w="70"/>
+              <w:right w:type="dxa" w:w="120"/>
+            </w:tcMar>
+            <w:vAlign w:val="center"/>
+          </w:tcPr>
+          <w:p>
+            <w:r>
+              <w:rPr>
+                <w:color w:val="666666"/>
+                <w:sz w:val="18"/>
+                <w:szCs w:val="18"/>
+              </w:rPr>
+              <w:t xml:space="preserve">10</w:t>
+            </w:r>
+          </w:p>
+        </w:tc>
+        <w:tc>
+          <w:tcPr>
+            <w:tcW w:type="dxa" w:w="3803"/>
+            <w:shd w:fill="F7F7F5" w:val="clear"/>
+            <w:tcMar>
+              <w:top w:type="dxa" w:w="70"/>
+              <w:left w:type="dxa" w:w="120"/>
+              <w:bottom w:type="dxa" w:w="70"/>
               <w:right w:type="dxa" w:w="120"/>
             </w:tcMar>
             <w:vAlign w:val="center"/>
@@ -1683,12 +1809,12 @@
         </w:trPr>
         <w:tc>
           <w:tcPr>
-            <w:tcW w:type="dxa" w:w="1600"/>
-            <w:shd w:fill="FFFFFF" w:val="clear"/>
-            <w:tcMar>
-              <w:top w:type="dxa" w:w="60"/>
-              <w:left w:type="dxa" w:w="120"/>
-              <w:bottom w:type="dxa" w:w="60"/>
+            <w:tcW w:type="dxa" w:w="1300"/>
+            <w:shd w:fill="FFFFFF" w:val="clear"/>
+            <w:tcMar>
+              <w:top w:type="dxa" w:w="70"/>
+              <w:left w:type="dxa" w:w="120"/>
+              <w:bottom w:type="dxa" w:w="70"/>
               <w:right w:type="dxa" w:w="120"/>
             </w:tcMar>
             <w:vAlign w:val="center"/>
@@ -1706,12 +1832,58 @@
         </w:tc>
         <w:tc>
           <w:tcPr>
-            <w:tcW w:type="dxa" w:w="8606"/>
-            <w:shd w:fill="FFFFFF" w:val="clear"/>
-            <w:tcMar>
-              <w:top w:type="dxa" w:w="60"/>
-              <w:left w:type="dxa" w:w="120"/>
-              <w:bottom w:type="dxa" w:w="60"/>
+            <w:tcW w:type="dxa" w:w="3803"/>
+            <w:shd w:fill="FFFFFF" w:val="clear"/>
+            <w:tcMar>
+              <w:top w:type="dxa" w:w="70"/>
+              <w:left w:type="dxa" w:w="120"/>
+              <w:bottom w:type="dxa" w:w="70"/>
+              <w:right w:type="dxa" w:w="120"/>
+            </w:tcMar>
+            <w:vAlign w:val="center"/>
+          </w:tcPr>
+          <w:p>
+            <w:r>
+              <w:rPr>
+                <w:color w:val="222222"/>
+                <w:sz w:val="20"/>
+                <w:szCs w:val="20"/>
+              </w:rPr>
+              <w:t xml:space="preserve">☐</w:t>
+            </w:r>
+          </w:p>
+        </w:tc>
+        <w:tc>
+          <w:tcPr>
+            <w:tcW w:type="dxa" w:w="1300"/>
+            <w:shd w:fill="FFFFFF" w:val="clear"/>
+            <w:tcMar>
+              <w:top w:type="dxa" w:w="70"/>
+              <w:left w:type="dxa" w:w="120"/>
+              <w:bottom w:type="dxa" w:w="70"/>
+              <w:right w:type="dxa" w:w="120"/>
+            </w:tcMar>
+            <w:vAlign w:val="center"/>
+          </w:tcPr>
+          <w:p>
+            <w:r>
+              <w:rPr>
+                <w:color w:val="666666"/>
+                <w:sz w:val="18"/>
+                <w:szCs w:val="18"/>
+              </w:rPr>
+              <w:t xml:space="preserve">11</w:t>
+            </w:r>
+          </w:p>
+        </w:tc>
+        <w:tc>
+          <w:tcPr>
+            <w:tcW w:type="dxa" w:w="3803"/>
+            <w:shd w:fill="FFFFFF" w:val="clear"/>
+            <w:tcMar>
+              <w:top w:type="dxa" w:w="70"/>
+              <w:left w:type="dxa" w:w="120"/>
+              <w:bottom w:type="dxa" w:w="70"/>
               <w:right w:type="dxa" w:w="120"/>
             </w:tcMar>
             <w:vAlign w:val="center"/>
@@ -1734,12 +1906,12 @@
         </w:trPr>
         <w:tc>
           <w:tcPr>
-            <w:tcW w:type="dxa" w:w="1600"/>
-            <w:shd w:fill="F7F7F5" w:val="clear"/>
-            <w:tcMar>
-              <w:top w:type="dxa" w:w="60"/>
-              <w:left w:type="dxa" w:w="120"/>
-              <w:bottom w:type="dxa" w:w="60"/>
+            <w:tcW w:type="dxa" w:w="1300"/>
+            <w:shd w:fill="F7F7F5" w:val="clear"/>
+            <w:tcMar>
+              <w:top w:type="dxa" w:w="70"/>
+              <w:left w:type="dxa" w:w="120"/>
+              <w:bottom w:type="dxa" w:w="70"/>
               <w:right w:type="dxa" w:w="120"/>
             </w:tcMar>
             <w:vAlign w:val="center"/>
@@ -1757,12 +1929,58 @@
         </w:tc>
         <w:tc>
           <w:tcPr>
-            <w:tcW w:type="dxa" w:w="8606"/>
-            <w:shd w:fill="F7F7F5" w:val="clear"/>
-            <w:tcMar>
-              <w:top w:type="dxa" w:w="60"/>
-              <w:left w:type="dxa" w:w="120"/>
-              <w:bottom w:type="dxa" w:w="60"/>
+            <w:tcW w:type="dxa" w:w="3803"/>
+            <w:shd w:fill="F7F7F5" w:val="clear"/>
+            <w:tcMar>
+              <w:top w:type="dxa" w:w="70"/>
+              <w:left w:type="dxa" w:w="120"/>
+              <w:bottom w:type="dxa" w:w="70"/>
+              <w:right w:type="dxa" w:w="120"/>
+            </w:tcMar>
+            <w:vAlign w:val="center"/>
+          </w:tcPr>
+          <w:p>
+            <w:r>
+              <w:rPr>
+                <w:color w:val="222222"/>
+                <w:sz w:val="20"/>
+                <w:szCs w:val="20"/>
+              </w:rPr>
+              <w:t xml:space="preserve">☐</w:t>
+            </w:r>
+          </w:p>
+        </w:tc>
+        <w:tc>
+          <w:tcPr>
+            <w:tcW w:type="dxa" w:w="1300"/>
+            <w:shd w:fill="F7F7F5" w:val="clear"/>
+            <w:tcMar>
+              <w:top w:type="dxa" w:w="70"/>
+              <w:left w:type="dxa" w:w="120"/>
+              <w:bottom w:type="dxa" w:w="70"/>
+              <w:right w:type="dxa" w:w="120"/>
+            </w:tcMar>
+            <w:vAlign w:val="center"/>
+          </w:tcPr>
+          <w:p>
+            <w:r>
+              <w:rPr>
+                <w:color w:val="666666"/>
+                <w:sz w:val="18"/>
+                <w:szCs w:val="18"/>
+              </w:rPr>
+              <w:t xml:space="preserve">12</w:t>
+            </w:r>
+          </w:p>
+        </w:tc>
+        <w:tc>
+          <w:tcPr>
+            <w:tcW w:type="dxa" w:w="3803"/>
+            <w:shd w:fill="F7F7F5" w:val="clear"/>
+            <w:tcMar>
+              <w:top w:type="dxa" w:w="70"/>
+              <w:left w:type="dxa" w:w="120"/>
+              <w:bottom w:type="dxa" w:w="70"/>
               <w:right w:type="dxa" w:w="120"/>
             </w:tcMar>
             <w:vAlign w:val="center"/>
@@ -1785,12 +2003,12 @@
         </w:trPr>
         <w:tc>
           <w:tcPr>
-            <w:tcW w:type="dxa" w:w="1600"/>
-            <w:shd w:fill="FFFFFF" w:val="clear"/>
-            <w:tcMar>
-              <w:top w:type="dxa" w:w="60"/>
-              <w:left w:type="dxa" w:w="120"/>
-              <w:bottom w:type="dxa" w:w="60"/>
+            <w:tcW w:type="dxa" w:w="1300"/>
+            <w:shd w:fill="FFFFFF" w:val="clear"/>
+            <w:tcMar>
+              <w:top w:type="dxa" w:w="70"/>
+              <w:left w:type="dxa" w:w="120"/>
+              <w:bottom w:type="dxa" w:w="70"/>
               <w:right w:type="dxa" w:w="120"/>
             </w:tcMar>
             <w:vAlign w:val="center"/>
@@ -1808,12 +2026,58 @@
         </w:tc>
         <w:tc>
           <w:tcPr>
-            <w:tcW w:type="dxa" w:w="8606"/>
-            <w:shd w:fill="FFFFFF" w:val="clear"/>
-            <w:tcMar>
-              <w:top w:type="dxa" w:w="60"/>
-              <w:left w:type="dxa" w:w="120"/>
-              <w:bottom w:type="dxa" w:w="60"/>
+            <w:tcW w:type="dxa" w:w="3803"/>
+            <w:shd w:fill="FFFFFF" w:val="clear"/>
+            <w:tcMar>
+              <w:top w:type="dxa" w:w="70"/>
+              <w:left w:type="dxa" w:w="120"/>
+              <w:bottom w:type="dxa" w:w="70"/>
+              <w:right w:type="dxa" w:w="120"/>
+            </w:tcMar>
+            <w:vAlign w:val="center"/>
+          </w:tcPr>
+          <w:p>
+            <w:r>
+              <w:rPr>
+                <w:color w:val="222222"/>
+                <w:sz w:val="20"/>
+                <w:szCs w:val="20"/>
+              </w:rPr>
+              <w:t xml:space="preserve">☐</w:t>
+            </w:r>
+          </w:p>
+        </w:tc>
+        <w:tc>
+          <w:tcPr>
+            <w:tcW w:type="dxa" w:w="1300"/>
+            <w:shd w:fill="FFFFFF" w:val="clear"/>
+            <w:tcMar>
+              <w:top w:type="dxa" w:w="70"/>
+              <w:left w:type="dxa" w:w="120"/>
+              <w:bottom w:type="dxa" w:w="70"/>
+              <w:right w:type="dxa" w:w="120"/>
+            </w:tcMar>
+            <w:vAlign w:val="center"/>
+          </w:tcPr>
+          <w:p>
+            <w:r>
+              <w:rPr>
+                <w:color w:val="666666"/>
+                <w:sz w:val="18"/>
+                <w:szCs w:val="18"/>
+              </w:rPr>
+              <w:t xml:space="preserve">13</w:t>
+            </w:r>
+          </w:p>
+        </w:tc>
+        <w:tc>
+          <w:tcPr>
+            <w:tcW w:type="dxa" w:w="3803"/>
+            <w:shd w:fill="FFFFFF" w:val="clear"/>
+            <w:tcMar>
+              <w:top w:type="dxa" w:w="70"/>
+              <w:left w:type="dxa" w:w="120"/>
+              <w:bottom w:type="dxa" w:w="70"/>
               <w:right w:type="dxa" w:w="120"/>
             </w:tcMar>
             <w:vAlign w:val="center"/>
@@ -1836,12 +2100,12 @@
         </w:trPr>
         <w:tc>
           <w:tcPr>
-            <w:tcW w:type="dxa" w:w="1600"/>
-            <w:shd w:fill="F7F7F5" w:val="clear"/>
-            <w:tcMar>
-              <w:top w:type="dxa" w:w="60"/>
-              <w:left w:type="dxa" w:w="120"/>
-              <w:bottom w:type="dxa" w:w="60"/>
+            <w:tcW w:type="dxa" w:w="1300"/>
+            <w:shd w:fill="F7F7F5" w:val="clear"/>
+            <w:tcMar>
+              <w:top w:type="dxa" w:w="70"/>
+              <w:left w:type="dxa" w:w="120"/>
+              <w:bottom w:type="dxa" w:w="70"/>
               <w:right w:type="dxa" w:w="120"/>
             </w:tcMar>
             <w:vAlign w:val="center"/>
@@ -1859,12 +2123,58 @@
         </w:tc>
         <w:tc>
           <w:tcPr>
-            <w:tcW w:type="dxa" w:w="8606"/>
-            <w:shd w:fill="F7F7F5" w:val="clear"/>
-            <w:tcMar>
-              <w:top w:type="dxa" w:w="60"/>
-              <w:left w:type="dxa" w:w="120"/>
-              <w:bottom w:type="dxa" w:w="60"/>
+            <w:tcW w:type="dxa" w:w="3803"/>
+            <w:shd w:fill="F7F7F5" w:val="clear"/>
+            <w:tcMar>
+              <w:top w:type="dxa" w:w="70"/>
+              <w:left w:type="dxa" w:w="120"/>
+              <w:bottom w:type="dxa" w:w="70"/>
+              <w:right w:type="dxa" w:w="120"/>
+            </w:tcMar>
+            <w:vAlign w:val="center"/>
+          </w:tcPr>
+          <w:p>
+            <w:r>
+              <w:rPr>
+                <w:color w:val="222222"/>
+                <w:sz w:val="20"/>
+                <w:szCs w:val="20"/>
+              </w:rPr>
+              <w:t xml:space="preserve">☐</w:t>
+            </w:r>
+          </w:p>
+        </w:tc>
+        <w:tc>
+          <w:tcPr>
+            <w:tcW w:type="dxa" w:w="1300"/>
+            <w:shd w:fill="F7F7F5" w:val="clear"/>
+            <w:tcMar>
+              <w:top w:type="dxa" w:w="70"/>
+              <w:left w:type="dxa" w:w="120"/>
+              <w:bottom w:type="dxa" w:w="70"/>
+              <w:right w:type="dxa" w:w="120"/>
+            </w:tcMar>
+            <w:vAlign w:val="center"/>
+          </w:tcPr>
+          <w:p>
+            <w:r>
+              <w:rPr>
+                <w:color w:val="666666"/>
+                <w:sz w:val="18"/>
+                <w:szCs w:val="18"/>
+              </w:rPr>
+              <w:t xml:space="preserve">14</w:t>
+            </w:r>
+          </w:p>
+        </w:tc>
+        <w:tc>
+          <w:tcPr>
+            <w:tcW w:type="dxa" w:w="3803"/>
+            <w:shd w:fill="F7F7F5" w:val="clear"/>
+            <w:tcMar>
+              <w:top w:type="dxa" w:w="70"/>
+              <w:left w:type="dxa" w:w="120"/>
+              <w:bottom w:type="dxa" w:w="70"/>
               <w:right w:type="dxa" w:w="120"/>
             </w:tcMar>
             <w:vAlign w:val="center"/>
@@ -1887,12 +2197,12 @@
         </w:trPr>
         <w:tc>
           <w:tcPr>
-            <w:tcW w:type="dxa" w:w="1600"/>
-            <w:shd w:fill="FFFFFF" w:val="clear"/>
-            <w:tcMar>
-              <w:top w:type="dxa" w:w="60"/>
-              <w:left w:type="dxa" w:w="120"/>
-              <w:bottom w:type="dxa" w:w="60"/>
+            <w:tcW w:type="dxa" w:w="1300"/>
+            <w:shd w:fill="FFFFFF" w:val="clear"/>
+            <w:tcMar>
+              <w:top w:type="dxa" w:w="70"/>
+              <w:left w:type="dxa" w:w="120"/>
+              <w:bottom w:type="dxa" w:w="70"/>
               <w:right w:type="dxa" w:w="120"/>
             </w:tcMar>
             <w:vAlign w:val="center"/>
@@ -1910,12 +2220,58 @@
         </w:tc>
         <w:tc>
           <w:tcPr>
-            <w:tcW w:type="dxa" w:w="8606"/>
-            <w:shd w:fill="FFFFFF" w:val="clear"/>
-            <w:tcMar>
-              <w:top w:type="dxa" w:w="60"/>
-              <w:left w:type="dxa" w:w="120"/>
-              <w:bottom w:type="dxa" w:w="60"/>
+            <w:tcW w:type="dxa" w:w="3803"/>
+            <w:shd w:fill="FFFFFF" w:val="clear"/>
+            <w:tcMar>
+              <w:top w:type="dxa" w:w="70"/>
+              <w:left w:type="dxa" w:w="120"/>
+              <w:bottom w:type="dxa" w:w="70"/>
+              <w:right w:type="dxa" w:w="120"/>
+            </w:tcMar>
+            <w:vAlign w:val="center"/>
+          </w:tcPr>
+          <w:p>
+            <w:r>
+              <w:rPr>
+                <w:color w:val="222222"/>
+                <w:sz w:val="20"/>
+                <w:szCs w:val="20"/>
+              </w:rPr>
+              <w:t xml:space="preserve">☐</w:t>
+            </w:r>
+          </w:p>
+        </w:tc>
+        <w:tc>
+          <w:tcPr>
+            <w:tcW w:type="dxa" w:w="1300"/>
+            <w:shd w:fill="FFFFFF" w:val="clear"/>
+            <w:tcMar>
+              <w:top w:type="dxa" w:w="70"/>
+              <w:left w:type="dxa" w:w="120"/>
+              <w:bottom w:type="dxa" w:w="70"/>
+              <w:right w:type="dxa" w:w="120"/>
+            </w:tcMar>
+            <w:vAlign w:val="center"/>
+          </w:tcPr>
+          <w:p>
+            <w:r>
+              <w:rPr>
+                <w:color w:val="666666"/>
+                <w:sz w:val="18"/>
+                <w:szCs w:val="18"/>
+              </w:rPr>
+              <w:t xml:space="preserve">15</w:t>
+            </w:r>
+          </w:p>
+        </w:tc>
+        <w:tc>
+          <w:tcPr>
+            <w:tcW w:type="dxa" w:w="3803"/>
+            <w:shd w:fill="FFFFFF" w:val="clear"/>
+            <w:tcMar>
+              <w:top w:type="dxa" w:w="70"/>
+              <w:left w:type="dxa" w:w="120"/>
+              <w:bottom w:type="dxa" w:w="70"/>
               <w:right w:type="dxa" w:w="120"/>
             </w:tcMar>
             <w:vAlign w:val="center"/>
@@ -1938,12 +2294,12 @@
         </w:trPr>
         <w:tc>
           <w:tcPr>
-            <w:tcW w:type="dxa" w:w="1600"/>
-            <w:shd w:fill="F7F7F5" w:val="clear"/>
-            <w:tcMar>
-              <w:top w:type="dxa" w:w="60"/>
-              <w:left w:type="dxa" w:w="120"/>
-              <w:bottom w:type="dxa" w:w="60"/>
+            <w:tcW w:type="dxa" w:w="1300"/>
+            <w:shd w:fill="F7F7F5" w:val="clear"/>
+            <w:tcMar>
+              <w:top w:type="dxa" w:w="70"/>
+              <w:left w:type="dxa" w:w="120"/>
+              <w:bottom w:type="dxa" w:w="70"/>
               <w:right w:type="dxa" w:w="120"/>
             </w:tcMar>
             <w:vAlign w:val="center"/>
@@ -1961,397 +2317,35 @@
         </w:tc>
         <w:tc>
           <w:tcPr>
-            <w:tcW w:type="dxa" w:w="8606"/>
-            <w:shd w:fill="F7F7F5" w:val="clear"/>
-            <w:tcMar>
-              <w:top w:type="dxa" w:w="60"/>
-              <w:left w:type="dxa" w:w="120"/>
-              <w:bottom w:type="dxa" w:w="60"/>
-              <w:right w:type="dxa" w:w="120"/>
-            </w:tcMar>
-            <w:vAlign w:val="center"/>
-          </w:tcPr>
-          <w:p>
-            <w:r>
-              <w:rPr>
-                <w:color w:val="222222"/>
-                <w:sz w:val="20"/>
-                <w:szCs w:val="20"/>
-              </w:rPr>
-              <w:t xml:space="preserve">☐</w:t>
-            </w:r>
-          </w:p>
-        </w:tc>
-      </w:tr>
-      <w:tr>
-        <w:trPr>
-          <w:cantSplit/>
-        </w:trPr>
-        <w:tc>
-          <w:tcPr>
-            <w:tcW w:type="dxa" w:w="1600"/>
-            <w:shd w:fill="FFFFFF" w:val="clear"/>
-            <w:tcMar>
-              <w:top w:type="dxa" w:w="60"/>
-              <w:left w:type="dxa" w:w="120"/>
-              <w:bottom w:type="dxa" w:w="60"/>
-              <w:right w:type="dxa" w:w="120"/>
-            </w:tcMar>
-            <w:vAlign w:val="center"/>
-          </w:tcPr>
-          <w:p>
-            <w:r>
-              <w:rPr>
-                <w:color w:val="666666"/>
-                <w:sz w:val="18"/>
-                <w:szCs w:val="18"/>
-              </w:rPr>
-              <w:t xml:space="preserve">9</w:t>
-            </w:r>
-          </w:p>
-        </w:tc>
-        <w:tc>
-          <w:tcPr>
-            <w:tcW w:type="dxa" w:w="8606"/>
-            <w:shd w:fill="FFFFFF" w:val="clear"/>
-            <w:tcMar>
-              <w:top w:type="dxa" w:w="60"/>
-              <w:left w:type="dxa" w:w="120"/>
-              <w:bottom w:type="dxa" w:w="60"/>
-              <w:right w:type="dxa" w:w="120"/>
-            </w:tcMar>
-            <w:vAlign w:val="center"/>
-          </w:tcPr>
-          <w:p>
-            <w:r>
-              <w:rPr>
-                <w:color w:val="222222"/>
-                <w:sz w:val="20"/>
-                <w:szCs w:val="20"/>
-              </w:rPr>
-              <w:t xml:space="preserve">☐</w:t>
-            </w:r>
-          </w:p>
-        </w:tc>
-      </w:tr>
-      <w:tr>
-        <w:trPr>
-          <w:cantSplit/>
-        </w:trPr>
-        <w:tc>
-          <w:tcPr>
-            <w:tcW w:type="dxa" w:w="1600"/>
-            <w:shd w:fill="F7F7F5" w:val="clear"/>
-            <w:tcMar>
-              <w:top w:type="dxa" w:w="60"/>
-              <w:left w:type="dxa" w:w="120"/>
-              <w:bottom w:type="dxa" w:w="60"/>
-              <w:right w:type="dxa" w:w="120"/>
-            </w:tcMar>
-            <w:vAlign w:val="center"/>
-          </w:tcPr>
-          <w:p>
-            <w:r>
-              <w:rPr>
-                <w:color w:val="666666"/>
-                <w:sz w:val="18"/>
-                <w:szCs w:val="18"/>
-              </w:rPr>
-              <w:t xml:space="preserve">10</w:t>
-            </w:r>
-          </w:p>
-        </w:tc>
-        <w:tc>
-          <w:tcPr>
-            <w:tcW w:type="dxa" w:w="8606"/>
-            <w:shd w:fill="F7F7F5" w:val="clear"/>
-            <w:tcMar>
-              <w:top w:type="dxa" w:w="60"/>
-              <w:left w:type="dxa" w:w="120"/>
-              <w:bottom w:type="dxa" w:w="60"/>
-              <w:right w:type="dxa" w:w="120"/>
-            </w:tcMar>
-            <w:vAlign w:val="center"/>
-          </w:tcPr>
-          <w:p>
-            <w:r>
-              <w:rPr>
-                <w:color w:val="222222"/>
-                <w:sz w:val="20"/>
-                <w:szCs w:val="20"/>
-              </w:rPr>
-              <w:t xml:space="preserve">☐</w:t>
-            </w:r>
-          </w:p>
-        </w:tc>
-      </w:tr>
-      <w:tr>
-        <w:trPr>
-          <w:cantSplit/>
-        </w:trPr>
-        <w:tc>
-          <w:tcPr>
-            <w:tcW w:type="dxa" w:w="1600"/>
-            <w:shd w:fill="FFFFFF" w:val="clear"/>
-            <w:tcMar>
-              <w:top w:type="dxa" w:w="60"/>
-              <w:left w:type="dxa" w:w="120"/>
-              <w:bottom w:type="dxa" w:w="60"/>
-              <w:right w:type="dxa" w:w="120"/>
-            </w:tcMar>
-            <w:vAlign w:val="center"/>
-          </w:tcPr>
-          <w:p>
-            <w:r>
-              <w:rPr>
-                <w:color w:val="666666"/>
-                <w:sz w:val="18"/>
-                <w:szCs w:val="18"/>
-              </w:rPr>
-              <w:t xml:space="preserve">11</w:t>
-            </w:r>
-          </w:p>
-        </w:tc>
-        <w:tc>
-          <w:tcPr>
-            <w:tcW w:type="dxa" w:w="8606"/>
-            <w:shd w:fill="FFFFFF" w:val="clear"/>
-            <w:tcMar>
-              <w:top w:type="dxa" w:w="60"/>
-              <w:left w:type="dxa" w:w="120"/>
-              <w:bottom w:type="dxa" w:w="60"/>
-              <w:right w:type="dxa" w:w="120"/>
-            </w:tcMar>
-            <w:vAlign w:val="center"/>
-          </w:tcPr>
-          <w:p>
-            <w:r>
-              <w:rPr>
-                <w:color w:val="222222"/>
-                <w:sz w:val="20"/>
-                <w:szCs w:val="20"/>
-              </w:rPr>
-              <w:t xml:space="preserve">☐</w:t>
-            </w:r>
-          </w:p>
-        </w:tc>
-      </w:tr>
-      <w:tr>
-        <w:trPr>
-          <w:cantSplit/>
-        </w:trPr>
-        <w:tc>
-          <w:tcPr>
-            <w:tcW w:type="dxa" w:w="1600"/>
-            <w:shd w:fill="F7F7F5" w:val="clear"/>
-            <w:tcMar>
-              <w:top w:type="dxa" w:w="60"/>
-              <w:left w:type="dxa" w:w="120"/>
-              <w:bottom w:type="dxa" w:w="60"/>
-              <w:right w:type="dxa" w:w="120"/>
-            </w:tcMar>
-            <w:vAlign w:val="center"/>
-          </w:tcPr>
-          <w:p>
-            <w:r>
-              <w:rPr>
-                <w:color w:val="666666"/>
-                <w:sz w:val="18"/>
-                <w:szCs w:val="18"/>
-              </w:rPr>
-              <w:t xml:space="preserve">12</w:t>
-            </w:r>
-          </w:p>
-        </w:tc>
-        <w:tc>
-          <w:tcPr>
-            <w:tcW w:type="dxa" w:w="8606"/>
-            <w:shd w:fill="F7F7F5" w:val="clear"/>
-            <w:tcMar>
-              <w:top w:type="dxa" w:w="60"/>
-              <w:left w:type="dxa" w:w="120"/>
-              <w:bottom w:type="dxa" w:w="60"/>
-              <w:right w:type="dxa" w:w="120"/>
-            </w:tcMar>
-            <w:vAlign w:val="center"/>
-          </w:tcPr>
-          <w:p>
-            <w:r>
-              <w:rPr>
-                <w:color w:val="222222"/>
-                <w:sz w:val="20"/>
-                <w:szCs w:val="20"/>
-              </w:rPr>
-              <w:t xml:space="preserve">☐</w:t>
-            </w:r>
-          </w:p>
-        </w:tc>
-      </w:tr>
-      <w:tr>
-        <w:trPr>
-          <w:cantSplit/>
-        </w:trPr>
-        <w:tc>
-          <w:tcPr>
-            <w:tcW w:type="dxa" w:w="1600"/>
-            <w:shd w:fill="FFFFFF" w:val="clear"/>
-            <w:tcMar>
-              <w:top w:type="dxa" w:w="60"/>
-              <w:left w:type="dxa" w:w="120"/>
-              <w:bottom w:type="dxa" w:w="60"/>
-              <w:right w:type="dxa" w:w="120"/>
-            </w:tcMar>
-            <w:vAlign w:val="center"/>
-          </w:tcPr>
-          <w:p>
-            <w:r>
-              <w:rPr>
-                <w:color w:val="666666"/>
-                <w:sz w:val="18"/>
-                <w:szCs w:val="18"/>
-              </w:rPr>
-              <w:t xml:space="preserve">13</w:t>
-            </w:r>
-          </w:p>
-        </w:tc>
-        <w:tc>
-          <w:tcPr>
-            <w:tcW w:type="dxa" w:w="8606"/>
-            <w:shd w:fill="FFFFFF" w:val="clear"/>
-            <w:tcMar>
-              <w:top w:type="dxa" w:w="60"/>
-              <w:left w:type="dxa" w:w="120"/>
-              <w:bottom w:type="dxa" w:w="60"/>
-              <w:right w:type="dxa" w:w="120"/>
-            </w:tcMar>
-            <w:vAlign w:val="center"/>
-          </w:tcPr>
-          <w:p>
-            <w:r>
-              <w:rPr>
-                <w:color w:val="222222"/>
-                <w:sz w:val="20"/>
-                <w:szCs w:val="20"/>
-              </w:rPr>
-              <w:t xml:space="preserve">☐</w:t>
-            </w:r>
-          </w:p>
-        </w:tc>
-      </w:tr>
-      <w:tr>
-        <w:trPr>
-          <w:cantSplit/>
-        </w:trPr>
-        <w:tc>
-          <w:tcPr>
-            <w:tcW w:type="dxa" w:w="1600"/>
-            <w:shd w:fill="F7F7F5" w:val="clear"/>
-            <w:tcMar>
-              <w:top w:type="dxa" w:w="60"/>
-              <w:left w:type="dxa" w:w="120"/>
-              <w:bottom w:type="dxa" w:w="60"/>
-              <w:right w:type="dxa" w:w="120"/>
-            </w:tcMar>
-            <w:vAlign w:val="center"/>
-          </w:tcPr>
-          <w:p>
-            <w:r>
-              <w:rPr>
-                <w:color w:val="666666"/>
-                <w:sz w:val="18"/>
-                <w:szCs w:val="18"/>
-              </w:rPr>
-              <w:t xml:space="preserve">14</w:t>
-            </w:r>
-          </w:p>
-        </w:tc>
-        <w:tc>
-          <w:tcPr>
-            <w:tcW w:type="dxa" w:w="8606"/>
-            <w:shd w:fill="F7F7F5" w:val="clear"/>
-            <w:tcMar>
-              <w:top w:type="dxa" w:w="60"/>
-              <w:left w:type="dxa" w:w="120"/>
-              <w:bottom w:type="dxa" w:w="60"/>
-              <w:right w:type="dxa" w:w="120"/>
-            </w:tcMar>
-            <w:vAlign w:val="center"/>
-          </w:tcPr>
-          <w:p>
-            <w:r>
-              <w:rPr>
-                <w:color w:val="222222"/>
-                <w:sz w:val="20"/>
-                <w:szCs w:val="20"/>
-              </w:rPr>
-              <w:t xml:space="preserve">☐</w:t>
-            </w:r>
-          </w:p>
-        </w:tc>
-      </w:tr>
-      <w:tr>
-        <w:trPr>
-          <w:cantSplit/>
-        </w:trPr>
-        <w:tc>
-          <w:tcPr>
-            <w:tcW w:type="dxa" w:w="1600"/>
-            <w:shd w:fill="FFFFFF" w:val="clear"/>
-            <w:tcMar>
-              <w:top w:type="dxa" w:w="60"/>
-              <w:left w:type="dxa" w:w="120"/>
-              <w:bottom w:type="dxa" w:w="60"/>
-              <w:right w:type="dxa" w:w="120"/>
-            </w:tcMar>
-            <w:vAlign w:val="center"/>
-          </w:tcPr>
-          <w:p>
-            <w:r>
-              <w:rPr>
-                <w:color w:val="666666"/>
-                <w:sz w:val="18"/>
-                <w:szCs w:val="18"/>
-              </w:rPr>
-              <w:t xml:space="preserve">15</w:t>
-            </w:r>
-          </w:p>
-        </w:tc>
-        <w:tc>
-          <w:tcPr>
-            <w:tcW w:type="dxa" w:w="8606"/>
-            <w:shd w:fill="FFFFFF" w:val="clear"/>
-            <w:tcMar>
-              <w:top w:type="dxa" w:w="60"/>
-              <w:left w:type="dxa" w:w="120"/>
-              <w:bottom w:type="dxa" w:w="60"/>
-              <w:right w:type="dxa" w:w="120"/>
-            </w:tcMar>
-            <w:vAlign w:val="center"/>
-          </w:tcPr>
-          <w:p>
-            <w:r>
-              <w:rPr>
-                <w:color w:val="222222"/>
-                <w:sz w:val="20"/>
-                <w:szCs w:val="20"/>
-              </w:rPr>
-              <w:t xml:space="preserve">☐</w:t>
-            </w:r>
-          </w:p>
-        </w:tc>
-      </w:tr>
-      <w:tr>
-        <w:trPr>
-          <w:cantSplit/>
-        </w:trPr>
-        <w:tc>
-          <w:tcPr>
-            <w:tcW w:type="dxa" w:w="1600"/>
-            <w:shd w:fill="F7F7F5" w:val="clear"/>
-            <w:tcMar>
-              <w:top w:type="dxa" w:w="60"/>
-              <w:left w:type="dxa" w:w="120"/>
-              <w:bottom w:type="dxa" w:w="60"/>
+            <w:tcW w:type="dxa" w:w="3803"/>
+            <w:shd w:fill="F7F7F5" w:val="clear"/>
+            <w:tcMar>
+              <w:top w:type="dxa" w:w="70"/>
+              <w:left w:type="dxa" w:w="120"/>
+              <w:bottom w:type="dxa" w:w="70"/>
+              <w:right w:type="dxa" w:w="120"/>
+            </w:tcMar>
+            <w:vAlign w:val="center"/>
+          </w:tcPr>
+          <w:p>
+            <w:r>
+              <w:rPr>
+                <w:color w:val="222222"/>
+                <w:sz w:val="20"/>
+                <w:szCs w:val="20"/>
+              </w:rPr>
+              <w:t xml:space="preserve">☐</w:t>
+            </w:r>
+          </w:p>
+        </w:tc>
+        <w:tc>
+          <w:tcPr>
+            <w:tcW w:type="dxa" w:w="1300"/>
+            <w:shd w:fill="F7F7F5" w:val="clear"/>
+            <w:tcMar>
+              <w:top w:type="dxa" w:w="70"/>
+              <w:left w:type="dxa" w:w="120"/>
+              <w:bottom w:type="dxa" w:w="70"/>
               <w:right w:type="dxa" w:w="120"/>
             </w:tcMar>
             <w:vAlign w:val="center"/>
@@ -2369,12 +2363,12 @@
         </w:tc>
         <w:tc>
           <w:tcPr>
-            <w:tcW w:type="dxa" w:w="8606"/>
-            <w:shd w:fill="F7F7F5" w:val="clear"/>
-            <w:tcMar>
-              <w:top w:type="dxa" w:w="60"/>
-              <w:left w:type="dxa" w:w="120"/>
-              <w:bottom w:type="dxa" w:w="60"/>
+            <w:tcW w:type="dxa" w:w="3803"/>
+            <w:shd w:fill="F7F7F5" w:val="clear"/>
+            <w:tcMar>
+              <w:top w:type="dxa" w:w="70"/>
+              <w:left w:type="dxa" w:w="120"/>
+              <w:bottom w:type="dxa" w:w="70"/>
               <w:right w:type="dxa" w:w="120"/>
             </w:tcMar>
             <w:vAlign w:val="center"/>

</xml_diff>

<commit_message>
Wertungszettel: 30 statt 16 Einträge pro Team
Co-Authored-By: Claude Sonnet 5 <noreply@anthropic.com>
Claude-Session: https://claude.ai/code/session_0158aNef5Z2PX38jwmhzm9Cg
</commit_message>
<xml_diff>
--- a/Tagesgruppe_4/8. Tag_Montag_17.08.2026/Geländespiel_Wertungszettel.docx
+++ b/Tagesgruppe_4/8. Tag_Montag_17.08.2026/Geländespiel_Wertungszettel.docx
@@ -432,7 +432,7 @@
                 <w:sz w:val="18"/>
                 <w:szCs w:val="18"/>
               </w:rPr>
-              <w:t xml:space="preserve">9</w:t>
+              <w:t xml:space="preserve">16</w:t>
             </w:r>
           </w:p>
         </w:tc>
@@ -529,7 +529,7 @@
                 <w:sz w:val="18"/>
                 <w:szCs w:val="18"/>
               </w:rPr>
-              <w:t xml:space="preserve">10</w:t>
+              <w:t xml:space="preserve">17</w:t>
             </w:r>
           </w:p>
         </w:tc>
@@ -626,7 +626,7 @@
                 <w:sz w:val="18"/>
                 <w:szCs w:val="18"/>
               </w:rPr>
-              <w:t xml:space="preserve">11</w:t>
+              <w:t xml:space="preserve">18</w:t>
             </w:r>
           </w:p>
         </w:tc>
@@ -723,7 +723,7 @@
                 <w:sz w:val="18"/>
                 <w:szCs w:val="18"/>
               </w:rPr>
-              <w:t xml:space="preserve">12</w:t>
+              <w:t xml:space="preserve">19</w:t>
             </w:r>
           </w:p>
         </w:tc>
@@ -820,7 +820,7 @@
                 <w:sz w:val="18"/>
                 <w:szCs w:val="18"/>
               </w:rPr>
-              <w:t xml:space="preserve">13</w:t>
+              <w:t xml:space="preserve">20</w:t>
             </w:r>
           </w:p>
         </w:tc>
@@ -917,7 +917,7 @@
                 <w:sz w:val="18"/>
                 <w:szCs w:val="18"/>
               </w:rPr>
-              <w:t xml:space="preserve">14</w:t>
+              <w:t xml:space="preserve">21</w:t>
             </w:r>
           </w:p>
         </w:tc>
@@ -1014,7 +1014,7 @@
                 <w:sz w:val="18"/>
                 <w:szCs w:val="18"/>
               </w:rPr>
-              <w:t xml:space="preserve">15</w:t>
+              <w:t xml:space="preserve">22</w:t>
             </w:r>
           </w:p>
         </w:tc>
@@ -1111,14 +1111,693 @@
                 <w:sz w:val="18"/>
                 <w:szCs w:val="18"/>
               </w:rPr>
-              <w:t xml:space="preserve">16</w:t>
-            </w:r>
-          </w:p>
-        </w:tc>
-        <w:tc>
-          <w:tcPr>
-            <w:tcW w:type="dxa" w:w="3803"/>
-            <w:shd w:fill="F7F7F5" w:val="clear"/>
+              <w:t xml:space="preserve">23</w:t>
+            </w:r>
+          </w:p>
+        </w:tc>
+        <w:tc>
+          <w:tcPr>
+            <w:tcW w:type="dxa" w:w="3803"/>
+            <w:shd w:fill="F7F7F5" w:val="clear"/>
+            <w:tcMar>
+              <w:top w:type="dxa" w:w="70"/>
+              <w:left w:type="dxa" w:w="120"/>
+              <w:bottom w:type="dxa" w:w="70"/>
+              <w:right w:type="dxa" w:w="120"/>
+            </w:tcMar>
+            <w:vAlign w:val="center"/>
+          </w:tcPr>
+          <w:p>
+            <w:r>
+              <w:rPr>
+                <w:color w:val="222222"/>
+                <w:sz w:val="20"/>
+                <w:szCs w:val="20"/>
+              </w:rPr>
+              <w:t xml:space="preserve">☐</w:t>
+            </w:r>
+          </w:p>
+        </w:tc>
+      </w:tr>
+      <w:tr>
+        <w:trPr>
+          <w:cantSplit/>
+        </w:trPr>
+        <w:tc>
+          <w:tcPr>
+            <w:tcW w:type="dxa" w:w="1300"/>
+            <w:shd w:fill="FFFFFF" w:val="clear"/>
+            <w:tcMar>
+              <w:top w:type="dxa" w:w="70"/>
+              <w:left w:type="dxa" w:w="120"/>
+              <w:bottom w:type="dxa" w:w="70"/>
+              <w:right w:type="dxa" w:w="120"/>
+            </w:tcMar>
+            <w:vAlign w:val="center"/>
+          </w:tcPr>
+          <w:p>
+            <w:r>
+              <w:rPr>
+                <w:color w:val="666666"/>
+                <w:sz w:val="18"/>
+                <w:szCs w:val="18"/>
+              </w:rPr>
+              <w:t xml:space="preserve">9</w:t>
+            </w:r>
+          </w:p>
+        </w:tc>
+        <w:tc>
+          <w:tcPr>
+            <w:tcW w:type="dxa" w:w="3803"/>
+            <w:shd w:fill="FFFFFF" w:val="clear"/>
+            <w:tcMar>
+              <w:top w:type="dxa" w:w="70"/>
+              <w:left w:type="dxa" w:w="120"/>
+              <w:bottom w:type="dxa" w:w="70"/>
+              <w:right w:type="dxa" w:w="120"/>
+            </w:tcMar>
+            <w:vAlign w:val="center"/>
+          </w:tcPr>
+          <w:p>
+            <w:r>
+              <w:rPr>
+                <w:color w:val="222222"/>
+                <w:sz w:val="20"/>
+                <w:szCs w:val="20"/>
+              </w:rPr>
+              <w:t xml:space="preserve">☐</w:t>
+            </w:r>
+          </w:p>
+        </w:tc>
+        <w:tc>
+          <w:tcPr>
+            <w:tcW w:type="dxa" w:w="1300"/>
+            <w:shd w:fill="FFFFFF" w:val="clear"/>
+            <w:tcMar>
+              <w:top w:type="dxa" w:w="70"/>
+              <w:left w:type="dxa" w:w="120"/>
+              <w:bottom w:type="dxa" w:w="70"/>
+              <w:right w:type="dxa" w:w="120"/>
+            </w:tcMar>
+            <w:vAlign w:val="center"/>
+          </w:tcPr>
+          <w:p>
+            <w:r>
+              <w:rPr>
+                <w:color w:val="666666"/>
+                <w:sz w:val="18"/>
+                <w:szCs w:val="18"/>
+              </w:rPr>
+              <w:t xml:space="preserve">24</w:t>
+            </w:r>
+          </w:p>
+        </w:tc>
+        <w:tc>
+          <w:tcPr>
+            <w:tcW w:type="dxa" w:w="3803"/>
+            <w:shd w:fill="FFFFFF" w:val="clear"/>
+            <w:tcMar>
+              <w:top w:type="dxa" w:w="70"/>
+              <w:left w:type="dxa" w:w="120"/>
+              <w:bottom w:type="dxa" w:w="70"/>
+              <w:right w:type="dxa" w:w="120"/>
+            </w:tcMar>
+            <w:vAlign w:val="center"/>
+          </w:tcPr>
+          <w:p>
+            <w:r>
+              <w:rPr>
+                <w:color w:val="222222"/>
+                <w:sz w:val="20"/>
+                <w:szCs w:val="20"/>
+              </w:rPr>
+              <w:t xml:space="preserve">☐</w:t>
+            </w:r>
+          </w:p>
+        </w:tc>
+      </w:tr>
+      <w:tr>
+        <w:trPr>
+          <w:cantSplit/>
+        </w:trPr>
+        <w:tc>
+          <w:tcPr>
+            <w:tcW w:type="dxa" w:w="1300"/>
+            <w:shd w:fill="F7F7F5" w:val="clear"/>
+            <w:tcMar>
+              <w:top w:type="dxa" w:w="70"/>
+              <w:left w:type="dxa" w:w="120"/>
+              <w:bottom w:type="dxa" w:w="70"/>
+              <w:right w:type="dxa" w:w="120"/>
+            </w:tcMar>
+            <w:vAlign w:val="center"/>
+          </w:tcPr>
+          <w:p>
+            <w:r>
+              <w:rPr>
+                <w:color w:val="666666"/>
+                <w:sz w:val="18"/>
+                <w:szCs w:val="18"/>
+              </w:rPr>
+              <w:t xml:space="preserve">10</w:t>
+            </w:r>
+          </w:p>
+        </w:tc>
+        <w:tc>
+          <w:tcPr>
+            <w:tcW w:type="dxa" w:w="3803"/>
+            <w:shd w:fill="F7F7F5" w:val="clear"/>
+            <w:tcMar>
+              <w:top w:type="dxa" w:w="70"/>
+              <w:left w:type="dxa" w:w="120"/>
+              <w:bottom w:type="dxa" w:w="70"/>
+              <w:right w:type="dxa" w:w="120"/>
+            </w:tcMar>
+            <w:vAlign w:val="center"/>
+          </w:tcPr>
+          <w:p>
+            <w:r>
+              <w:rPr>
+                <w:color w:val="222222"/>
+                <w:sz w:val="20"/>
+                <w:szCs w:val="20"/>
+              </w:rPr>
+              <w:t xml:space="preserve">☐</w:t>
+            </w:r>
+          </w:p>
+        </w:tc>
+        <w:tc>
+          <w:tcPr>
+            <w:tcW w:type="dxa" w:w="1300"/>
+            <w:shd w:fill="F7F7F5" w:val="clear"/>
+            <w:tcMar>
+              <w:top w:type="dxa" w:w="70"/>
+              <w:left w:type="dxa" w:w="120"/>
+              <w:bottom w:type="dxa" w:w="70"/>
+              <w:right w:type="dxa" w:w="120"/>
+            </w:tcMar>
+            <w:vAlign w:val="center"/>
+          </w:tcPr>
+          <w:p>
+            <w:r>
+              <w:rPr>
+                <w:color w:val="666666"/>
+                <w:sz w:val="18"/>
+                <w:szCs w:val="18"/>
+              </w:rPr>
+              <w:t xml:space="preserve">25</w:t>
+            </w:r>
+          </w:p>
+        </w:tc>
+        <w:tc>
+          <w:tcPr>
+            <w:tcW w:type="dxa" w:w="3803"/>
+            <w:shd w:fill="F7F7F5" w:val="clear"/>
+            <w:tcMar>
+              <w:top w:type="dxa" w:w="70"/>
+              <w:left w:type="dxa" w:w="120"/>
+              <w:bottom w:type="dxa" w:w="70"/>
+              <w:right w:type="dxa" w:w="120"/>
+            </w:tcMar>
+            <w:vAlign w:val="center"/>
+          </w:tcPr>
+          <w:p>
+            <w:r>
+              <w:rPr>
+                <w:color w:val="222222"/>
+                <w:sz w:val="20"/>
+                <w:szCs w:val="20"/>
+              </w:rPr>
+              <w:t xml:space="preserve">☐</w:t>
+            </w:r>
+          </w:p>
+        </w:tc>
+      </w:tr>
+      <w:tr>
+        <w:trPr>
+          <w:cantSplit/>
+        </w:trPr>
+        <w:tc>
+          <w:tcPr>
+            <w:tcW w:type="dxa" w:w="1300"/>
+            <w:shd w:fill="FFFFFF" w:val="clear"/>
+            <w:tcMar>
+              <w:top w:type="dxa" w:w="70"/>
+              <w:left w:type="dxa" w:w="120"/>
+              <w:bottom w:type="dxa" w:w="70"/>
+              <w:right w:type="dxa" w:w="120"/>
+            </w:tcMar>
+            <w:vAlign w:val="center"/>
+          </w:tcPr>
+          <w:p>
+            <w:r>
+              <w:rPr>
+                <w:color w:val="666666"/>
+                <w:sz w:val="18"/>
+                <w:szCs w:val="18"/>
+              </w:rPr>
+              <w:t xml:space="preserve">11</w:t>
+            </w:r>
+          </w:p>
+        </w:tc>
+        <w:tc>
+          <w:tcPr>
+            <w:tcW w:type="dxa" w:w="3803"/>
+            <w:shd w:fill="FFFFFF" w:val="clear"/>
+            <w:tcMar>
+              <w:top w:type="dxa" w:w="70"/>
+              <w:left w:type="dxa" w:w="120"/>
+              <w:bottom w:type="dxa" w:w="70"/>
+              <w:right w:type="dxa" w:w="120"/>
+            </w:tcMar>
+            <w:vAlign w:val="center"/>
+          </w:tcPr>
+          <w:p>
+            <w:r>
+              <w:rPr>
+                <w:color w:val="222222"/>
+                <w:sz w:val="20"/>
+                <w:szCs w:val="20"/>
+              </w:rPr>
+              <w:t xml:space="preserve">☐</w:t>
+            </w:r>
+          </w:p>
+        </w:tc>
+        <w:tc>
+          <w:tcPr>
+            <w:tcW w:type="dxa" w:w="1300"/>
+            <w:shd w:fill="FFFFFF" w:val="clear"/>
+            <w:tcMar>
+              <w:top w:type="dxa" w:w="70"/>
+              <w:left w:type="dxa" w:w="120"/>
+              <w:bottom w:type="dxa" w:w="70"/>
+              <w:right w:type="dxa" w:w="120"/>
+            </w:tcMar>
+            <w:vAlign w:val="center"/>
+          </w:tcPr>
+          <w:p>
+            <w:r>
+              <w:rPr>
+                <w:color w:val="666666"/>
+                <w:sz w:val="18"/>
+                <w:szCs w:val="18"/>
+              </w:rPr>
+              <w:t xml:space="preserve">26</w:t>
+            </w:r>
+          </w:p>
+        </w:tc>
+        <w:tc>
+          <w:tcPr>
+            <w:tcW w:type="dxa" w:w="3803"/>
+            <w:shd w:fill="FFFFFF" w:val="clear"/>
+            <w:tcMar>
+              <w:top w:type="dxa" w:w="70"/>
+              <w:left w:type="dxa" w:w="120"/>
+              <w:bottom w:type="dxa" w:w="70"/>
+              <w:right w:type="dxa" w:w="120"/>
+            </w:tcMar>
+            <w:vAlign w:val="center"/>
+          </w:tcPr>
+          <w:p>
+            <w:r>
+              <w:rPr>
+                <w:color w:val="222222"/>
+                <w:sz w:val="20"/>
+                <w:szCs w:val="20"/>
+              </w:rPr>
+              <w:t xml:space="preserve">☐</w:t>
+            </w:r>
+          </w:p>
+        </w:tc>
+      </w:tr>
+      <w:tr>
+        <w:trPr>
+          <w:cantSplit/>
+        </w:trPr>
+        <w:tc>
+          <w:tcPr>
+            <w:tcW w:type="dxa" w:w="1300"/>
+            <w:shd w:fill="F7F7F5" w:val="clear"/>
+            <w:tcMar>
+              <w:top w:type="dxa" w:w="70"/>
+              <w:left w:type="dxa" w:w="120"/>
+              <w:bottom w:type="dxa" w:w="70"/>
+              <w:right w:type="dxa" w:w="120"/>
+            </w:tcMar>
+            <w:vAlign w:val="center"/>
+          </w:tcPr>
+          <w:p>
+            <w:r>
+              <w:rPr>
+                <w:color w:val="666666"/>
+                <w:sz w:val="18"/>
+                <w:szCs w:val="18"/>
+              </w:rPr>
+              <w:t xml:space="preserve">12</w:t>
+            </w:r>
+          </w:p>
+        </w:tc>
+        <w:tc>
+          <w:tcPr>
+            <w:tcW w:type="dxa" w:w="3803"/>
+            <w:shd w:fill="F7F7F5" w:val="clear"/>
+            <w:tcMar>
+              <w:top w:type="dxa" w:w="70"/>
+              <w:left w:type="dxa" w:w="120"/>
+              <w:bottom w:type="dxa" w:w="70"/>
+              <w:right w:type="dxa" w:w="120"/>
+            </w:tcMar>
+            <w:vAlign w:val="center"/>
+          </w:tcPr>
+          <w:p>
+            <w:r>
+              <w:rPr>
+                <w:color w:val="222222"/>
+                <w:sz w:val="20"/>
+                <w:szCs w:val="20"/>
+              </w:rPr>
+              <w:t xml:space="preserve">☐</w:t>
+            </w:r>
+          </w:p>
+        </w:tc>
+        <w:tc>
+          <w:tcPr>
+            <w:tcW w:type="dxa" w:w="1300"/>
+            <w:shd w:fill="F7F7F5" w:val="clear"/>
+            <w:tcMar>
+              <w:top w:type="dxa" w:w="70"/>
+              <w:left w:type="dxa" w:w="120"/>
+              <w:bottom w:type="dxa" w:w="70"/>
+              <w:right w:type="dxa" w:w="120"/>
+            </w:tcMar>
+            <w:vAlign w:val="center"/>
+          </w:tcPr>
+          <w:p>
+            <w:r>
+              <w:rPr>
+                <w:color w:val="666666"/>
+                <w:sz w:val="18"/>
+                <w:szCs w:val="18"/>
+              </w:rPr>
+              <w:t xml:space="preserve">27</w:t>
+            </w:r>
+          </w:p>
+        </w:tc>
+        <w:tc>
+          <w:tcPr>
+            <w:tcW w:type="dxa" w:w="3803"/>
+            <w:shd w:fill="F7F7F5" w:val="clear"/>
+            <w:tcMar>
+              <w:top w:type="dxa" w:w="70"/>
+              <w:left w:type="dxa" w:w="120"/>
+              <w:bottom w:type="dxa" w:w="70"/>
+              <w:right w:type="dxa" w:w="120"/>
+            </w:tcMar>
+            <w:vAlign w:val="center"/>
+          </w:tcPr>
+          <w:p>
+            <w:r>
+              <w:rPr>
+                <w:color w:val="222222"/>
+                <w:sz w:val="20"/>
+                <w:szCs w:val="20"/>
+              </w:rPr>
+              <w:t xml:space="preserve">☐</w:t>
+            </w:r>
+          </w:p>
+        </w:tc>
+      </w:tr>
+      <w:tr>
+        <w:trPr>
+          <w:cantSplit/>
+        </w:trPr>
+        <w:tc>
+          <w:tcPr>
+            <w:tcW w:type="dxa" w:w="1300"/>
+            <w:shd w:fill="FFFFFF" w:val="clear"/>
+            <w:tcMar>
+              <w:top w:type="dxa" w:w="70"/>
+              <w:left w:type="dxa" w:w="120"/>
+              <w:bottom w:type="dxa" w:w="70"/>
+              <w:right w:type="dxa" w:w="120"/>
+            </w:tcMar>
+            <w:vAlign w:val="center"/>
+          </w:tcPr>
+          <w:p>
+            <w:r>
+              <w:rPr>
+                <w:color w:val="666666"/>
+                <w:sz w:val="18"/>
+                <w:szCs w:val="18"/>
+              </w:rPr>
+              <w:t xml:space="preserve">13</w:t>
+            </w:r>
+          </w:p>
+        </w:tc>
+        <w:tc>
+          <w:tcPr>
+            <w:tcW w:type="dxa" w:w="3803"/>
+            <w:shd w:fill="FFFFFF" w:val="clear"/>
+            <w:tcMar>
+              <w:top w:type="dxa" w:w="70"/>
+              <w:left w:type="dxa" w:w="120"/>
+              <w:bottom w:type="dxa" w:w="70"/>
+              <w:right w:type="dxa" w:w="120"/>
+            </w:tcMar>
+            <w:vAlign w:val="center"/>
+          </w:tcPr>
+          <w:p>
+            <w:r>
+              <w:rPr>
+                <w:color w:val="222222"/>
+                <w:sz w:val="20"/>
+                <w:szCs w:val="20"/>
+              </w:rPr>
+              <w:t xml:space="preserve">☐</w:t>
+            </w:r>
+          </w:p>
+        </w:tc>
+        <w:tc>
+          <w:tcPr>
+            <w:tcW w:type="dxa" w:w="1300"/>
+            <w:shd w:fill="FFFFFF" w:val="clear"/>
+            <w:tcMar>
+              <w:top w:type="dxa" w:w="70"/>
+              <w:left w:type="dxa" w:w="120"/>
+              <w:bottom w:type="dxa" w:w="70"/>
+              <w:right w:type="dxa" w:w="120"/>
+            </w:tcMar>
+            <w:vAlign w:val="center"/>
+          </w:tcPr>
+          <w:p>
+            <w:r>
+              <w:rPr>
+                <w:color w:val="666666"/>
+                <w:sz w:val="18"/>
+                <w:szCs w:val="18"/>
+              </w:rPr>
+              <w:t xml:space="preserve">28</w:t>
+            </w:r>
+          </w:p>
+        </w:tc>
+        <w:tc>
+          <w:tcPr>
+            <w:tcW w:type="dxa" w:w="3803"/>
+            <w:shd w:fill="FFFFFF" w:val="clear"/>
+            <w:tcMar>
+              <w:top w:type="dxa" w:w="70"/>
+              <w:left w:type="dxa" w:w="120"/>
+              <w:bottom w:type="dxa" w:w="70"/>
+              <w:right w:type="dxa" w:w="120"/>
+            </w:tcMar>
+            <w:vAlign w:val="center"/>
+          </w:tcPr>
+          <w:p>
+            <w:r>
+              <w:rPr>
+                <w:color w:val="222222"/>
+                <w:sz w:val="20"/>
+                <w:szCs w:val="20"/>
+              </w:rPr>
+              <w:t xml:space="preserve">☐</w:t>
+            </w:r>
+          </w:p>
+        </w:tc>
+      </w:tr>
+      <w:tr>
+        <w:trPr>
+          <w:cantSplit/>
+        </w:trPr>
+        <w:tc>
+          <w:tcPr>
+            <w:tcW w:type="dxa" w:w="1300"/>
+            <w:shd w:fill="F7F7F5" w:val="clear"/>
+            <w:tcMar>
+              <w:top w:type="dxa" w:w="70"/>
+              <w:left w:type="dxa" w:w="120"/>
+              <w:bottom w:type="dxa" w:w="70"/>
+              <w:right w:type="dxa" w:w="120"/>
+            </w:tcMar>
+            <w:vAlign w:val="center"/>
+          </w:tcPr>
+          <w:p>
+            <w:r>
+              <w:rPr>
+                <w:color w:val="666666"/>
+                <w:sz w:val="18"/>
+                <w:szCs w:val="18"/>
+              </w:rPr>
+              <w:t xml:space="preserve">14</w:t>
+            </w:r>
+          </w:p>
+        </w:tc>
+        <w:tc>
+          <w:tcPr>
+            <w:tcW w:type="dxa" w:w="3803"/>
+            <w:shd w:fill="F7F7F5" w:val="clear"/>
+            <w:tcMar>
+              <w:top w:type="dxa" w:w="70"/>
+              <w:left w:type="dxa" w:w="120"/>
+              <w:bottom w:type="dxa" w:w="70"/>
+              <w:right w:type="dxa" w:w="120"/>
+            </w:tcMar>
+            <w:vAlign w:val="center"/>
+          </w:tcPr>
+          <w:p>
+            <w:r>
+              <w:rPr>
+                <w:color w:val="222222"/>
+                <w:sz w:val="20"/>
+                <w:szCs w:val="20"/>
+              </w:rPr>
+              <w:t xml:space="preserve">☐</w:t>
+            </w:r>
+          </w:p>
+        </w:tc>
+        <w:tc>
+          <w:tcPr>
+            <w:tcW w:type="dxa" w:w="1300"/>
+            <w:shd w:fill="F7F7F5" w:val="clear"/>
+            <w:tcMar>
+              <w:top w:type="dxa" w:w="70"/>
+              <w:left w:type="dxa" w:w="120"/>
+              <w:bottom w:type="dxa" w:w="70"/>
+              <w:right w:type="dxa" w:w="120"/>
+            </w:tcMar>
+            <w:vAlign w:val="center"/>
+          </w:tcPr>
+          <w:p>
+            <w:r>
+              <w:rPr>
+                <w:color w:val="666666"/>
+                <w:sz w:val="18"/>
+                <w:szCs w:val="18"/>
+              </w:rPr>
+              <w:t xml:space="preserve">29</w:t>
+            </w:r>
+          </w:p>
+        </w:tc>
+        <w:tc>
+          <w:tcPr>
+            <w:tcW w:type="dxa" w:w="3803"/>
+            <w:shd w:fill="F7F7F5" w:val="clear"/>
+            <w:tcMar>
+              <w:top w:type="dxa" w:w="70"/>
+              <w:left w:type="dxa" w:w="120"/>
+              <w:bottom w:type="dxa" w:w="70"/>
+              <w:right w:type="dxa" w:w="120"/>
+            </w:tcMar>
+            <w:vAlign w:val="center"/>
+          </w:tcPr>
+          <w:p>
+            <w:r>
+              <w:rPr>
+                <w:color w:val="222222"/>
+                <w:sz w:val="20"/>
+                <w:szCs w:val="20"/>
+              </w:rPr>
+              <w:t xml:space="preserve">☐</w:t>
+            </w:r>
+          </w:p>
+        </w:tc>
+      </w:tr>
+      <w:tr>
+        <w:trPr>
+          <w:cantSplit/>
+        </w:trPr>
+        <w:tc>
+          <w:tcPr>
+            <w:tcW w:type="dxa" w:w="1300"/>
+            <w:shd w:fill="FFFFFF" w:val="clear"/>
+            <w:tcMar>
+              <w:top w:type="dxa" w:w="70"/>
+              <w:left w:type="dxa" w:w="120"/>
+              <w:bottom w:type="dxa" w:w="70"/>
+              <w:right w:type="dxa" w:w="120"/>
+            </w:tcMar>
+            <w:vAlign w:val="center"/>
+          </w:tcPr>
+          <w:p>
+            <w:r>
+              <w:rPr>
+                <w:color w:val="666666"/>
+                <w:sz w:val="18"/>
+                <w:szCs w:val="18"/>
+              </w:rPr>
+              <w:t xml:space="preserve">15</w:t>
+            </w:r>
+          </w:p>
+        </w:tc>
+        <w:tc>
+          <w:tcPr>
+            <w:tcW w:type="dxa" w:w="3803"/>
+            <w:shd w:fill="FFFFFF" w:val="clear"/>
+            <w:tcMar>
+              <w:top w:type="dxa" w:w="70"/>
+              <w:left w:type="dxa" w:w="120"/>
+              <w:bottom w:type="dxa" w:w="70"/>
+              <w:right w:type="dxa" w:w="120"/>
+            </w:tcMar>
+            <w:vAlign w:val="center"/>
+          </w:tcPr>
+          <w:p>
+            <w:r>
+              <w:rPr>
+                <w:color w:val="222222"/>
+                <w:sz w:val="20"/>
+                <w:szCs w:val="20"/>
+              </w:rPr>
+              <w:t xml:space="preserve">☐</w:t>
+            </w:r>
+          </w:p>
+        </w:tc>
+        <w:tc>
+          <w:tcPr>
+            <w:tcW w:type="dxa" w:w="1300"/>
+            <w:shd w:fill="FFFFFF" w:val="clear"/>
+            <w:tcMar>
+              <w:top w:type="dxa" w:w="70"/>
+              <w:left w:type="dxa" w:w="120"/>
+              <w:bottom w:type="dxa" w:w="70"/>
+              <w:right w:type="dxa" w:w="120"/>
+            </w:tcMar>
+            <w:vAlign w:val="center"/>
+          </w:tcPr>
+          <w:p>
+            <w:r>
+              <w:rPr>
+                <w:color w:val="666666"/>
+                <w:sz w:val="18"/>
+                <w:szCs w:val="18"/>
+              </w:rPr>
+              <w:t xml:space="preserve">30</w:t>
+            </w:r>
+          </w:p>
+        </w:tc>
+        <w:tc>
+          <w:tcPr>
+            <w:tcW w:type="dxa" w:w="3803"/>
+            <w:shd w:fill="FFFFFF" w:val="clear"/>
             <w:tcMar>
               <w:top w:type="dxa" w:w="70"/>
               <w:left w:type="dxa" w:w="120"/>
@@ -1678,7 +2357,7 @@
                 <w:sz w:val="18"/>
                 <w:szCs w:val="18"/>
               </w:rPr>
-              <w:t xml:space="preserve">9</w:t>
+              <w:t xml:space="preserve">16</w:t>
             </w:r>
           </w:p>
         </w:tc>
@@ -1775,7 +2454,7 @@
                 <w:sz w:val="18"/>
                 <w:szCs w:val="18"/>
               </w:rPr>
-              <w:t xml:space="preserve">10</w:t>
+              <w:t xml:space="preserve">17</w:t>
             </w:r>
           </w:p>
         </w:tc>
@@ -1872,7 +2551,7 @@
                 <w:sz w:val="18"/>
                 <w:szCs w:val="18"/>
               </w:rPr>
-              <w:t xml:space="preserve">11</w:t>
+              <w:t xml:space="preserve">18</w:t>
             </w:r>
           </w:p>
         </w:tc>
@@ -1969,7 +2648,7 @@
                 <w:sz w:val="18"/>
                 <w:szCs w:val="18"/>
               </w:rPr>
-              <w:t xml:space="preserve">12</w:t>
+              <w:t xml:space="preserve">19</w:t>
             </w:r>
           </w:p>
         </w:tc>
@@ -2066,7 +2745,7 @@
                 <w:sz w:val="18"/>
                 <w:szCs w:val="18"/>
               </w:rPr>
-              <w:t xml:space="preserve">13</w:t>
+              <w:t xml:space="preserve">20</w:t>
             </w:r>
           </w:p>
         </w:tc>
@@ -2163,7 +2842,7 @@
                 <w:sz w:val="18"/>
                 <w:szCs w:val="18"/>
               </w:rPr>
-              <w:t xml:space="preserve">14</w:t>
+              <w:t xml:space="preserve">21</w:t>
             </w:r>
           </w:p>
         </w:tc>
@@ -2260,7 +2939,7 @@
                 <w:sz w:val="18"/>
                 <w:szCs w:val="18"/>
               </w:rPr>
-              <w:t xml:space="preserve">15</w:t>
+              <w:t xml:space="preserve">22</w:t>
             </w:r>
           </w:p>
         </w:tc>
@@ -2357,14 +3036,693 @@
                 <w:sz w:val="18"/>
                 <w:szCs w:val="18"/>
               </w:rPr>
-              <w:t xml:space="preserve">16</w:t>
-            </w:r>
-          </w:p>
-        </w:tc>
-        <w:tc>
-          <w:tcPr>
-            <w:tcW w:type="dxa" w:w="3803"/>
-            <w:shd w:fill="F7F7F5" w:val="clear"/>
+              <w:t xml:space="preserve">23</w:t>
+            </w:r>
+          </w:p>
+        </w:tc>
+        <w:tc>
+          <w:tcPr>
+            <w:tcW w:type="dxa" w:w="3803"/>
+            <w:shd w:fill="F7F7F5" w:val="clear"/>
+            <w:tcMar>
+              <w:top w:type="dxa" w:w="70"/>
+              <w:left w:type="dxa" w:w="120"/>
+              <w:bottom w:type="dxa" w:w="70"/>
+              <w:right w:type="dxa" w:w="120"/>
+            </w:tcMar>
+            <w:vAlign w:val="center"/>
+          </w:tcPr>
+          <w:p>
+            <w:r>
+              <w:rPr>
+                <w:color w:val="222222"/>
+                <w:sz w:val="20"/>
+                <w:szCs w:val="20"/>
+              </w:rPr>
+              <w:t xml:space="preserve">☐</w:t>
+            </w:r>
+          </w:p>
+        </w:tc>
+      </w:tr>
+      <w:tr>
+        <w:trPr>
+          <w:cantSplit/>
+        </w:trPr>
+        <w:tc>
+          <w:tcPr>
+            <w:tcW w:type="dxa" w:w="1300"/>
+            <w:shd w:fill="FFFFFF" w:val="clear"/>
+            <w:tcMar>
+              <w:top w:type="dxa" w:w="70"/>
+              <w:left w:type="dxa" w:w="120"/>
+              <w:bottom w:type="dxa" w:w="70"/>
+              <w:right w:type="dxa" w:w="120"/>
+            </w:tcMar>
+            <w:vAlign w:val="center"/>
+          </w:tcPr>
+          <w:p>
+            <w:r>
+              <w:rPr>
+                <w:color w:val="666666"/>
+                <w:sz w:val="18"/>
+                <w:szCs w:val="18"/>
+              </w:rPr>
+              <w:t xml:space="preserve">9</w:t>
+            </w:r>
+          </w:p>
+        </w:tc>
+        <w:tc>
+          <w:tcPr>
+            <w:tcW w:type="dxa" w:w="3803"/>
+            <w:shd w:fill="FFFFFF" w:val="clear"/>
+            <w:tcMar>
+              <w:top w:type="dxa" w:w="70"/>
+              <w:left w:type="dxa" w:w="120"/>
+              <w:bottom w:type="dxa" w:w="70"/>
+              <w:right w:type="dxa" w:w="120"/>
+            </w:tcMar>
+            <w:vAlign w:val="center"/>
+          </w:tcPr>
+          <w:p>
+            <w:r>
+              <w:rPr>
+                <w:color w:val="222222"/>
+                <w:sz w:val="20"/>
+                <w:szCs w:val="20"/>
+              </w:rPr>
+              <w:t xml:space="preserve">☐</w:t>
+            </w:r>
+          </w:p>
+        </w:tc>
+        <w:tc>
+          <w:tcPr>
+            <w:tcW w:type="dxa" w:w="1300"/>
+            <w:shd w:fill="FFFFFF" w:val="clear"/>
+            <w:tcMar>
+              <w:top w:type="dxa" w:w="70"/>
+              <w:left w:type="dxa" w:w="120"/>
+              <w:bottom w:type="dxa" w:w="70"/>
+              <w:right w:type="dxa" w:w="120"/>
+            </w:tcMar>
+            <w:vAlign w:val="center"/>
+          </w:tcPr>
+          <w:p>
+            <w:r>
+              <w:rPr>
+                <w:color w:val="666666"/>
+                <w:sz w:val="18"/>
+                <w:szCs w:val="18"/>
+              </w:rPr>
+              <w:t xml:space="preserve">24</w:t>
+            </w:r>
+          </w:p>
+        </w:tc>
+        <w:tc>
+          <w:tcPr>
+            <w:tcW w:type="dxa" w:w="3803"/>
+            <w:shd w:fill="FFFFFF" w:val="clear"/>
+            <w:tcMar>
+              <w:top w:type="dxa" w:w="70"/>
+              <w:left w:type="dxa" w:w="120"/>
+              <w:bottom w:type="dxa" w:w="70"/>
+              <w:right w:type="dxa" w:w="120"/>
+            </w:tcMar>
+            <w:vAlign w:val="center"/>
+          </w:tcPr>
+          <w:p>
+            <w:r>
+              <w:rPr>
+                <w:color w:val="222222"/>
+                <w:sz w:val="20"/>
+                <w:szCs w:val="20"/>
+              </w:rPr>
+              <w:t xml:space="preserve">☐</w:t>
+            </w:r>
+          </w:p>
+        </w:tc>
+      </w:tr>
+      <w:tr>
+        <w:trPr>
+          <w:cantSplit/>
+        </w:trPr>
+        <w:tc>
+          <w:tcPr>
+            <w:tcW w:type="dxa" w:w="1300"/>
+            <w:shd w:fill="F7F7F5" w:val="clear"/>
+            <w:tcMar>
+              <w:top w:type="dxa" w:w="70"/>
+              <w:left w:type="dxa" w:w="120"/>
+              <w:bottom w:type="dxa" w:w="70"/>
+              <w:right w:type="dxa" w:w="120"/>
+            </w:tcMar>
+            <w:vAlign w:val="center"/>
+          </w:tcPr>
+          <w:p>
+            <w:r>
+              <w:rPr>
+                <w:color w:val="666666"/>
+                <w:sz w:val="18"/>
+                <w:szCs w:val="18"/>
+              </w:rPr>
+              <w:t xml:space="preserve">10</w:t>
+            </w:r>
+          </w:p>
+        </w:tc>
+        <w:tc>
+          <w:tcPr>
+            <w:tcW w:type="dxa" w:w="3803"/>
+            <w:shd w:fill="F7F7F5" w:val="clear"/>
+            <w:tcMar>
+              <w:top w:type="dxa" w:w="70"/>
+              <w:left w:type="dxa" w:w="120"/>
+              <w:bottom w:type="dxa" w:w="70"/>
+              <w:right w:type="dxa" w:w="120"/>
+            </w:tcMar>
+            <w:vAlign w:val="center"/>
+          </w:tcPr>
+          <w:p>
+            <w:r>
+              <w:rPr>
+                <w:color w:val="222222"/>
+                <w:sz w:val="20"/>
+                <w:szCs w:val="20"/>
+              </w:rPr>
+              <w:t xml:space="preserve">☐</w:t>
+            </w:r>
+          </w:p>
+        </w:tc>
+        <w:tc>
+          <w:tcPr>
+            <w:tcW w:type="dxa" w:w="1300"/>
+            <w:shd w:fill="F7F7F5" w:val="clear"/>
+            <w:tcMar>
+              <w:top w:type="dxa" w:w="70"/>
+              <w:left w:type="dxa" w:w="120"/>
+              <w:bottom w:type="dxa" w:w="70"/>
+              <w:right w:type="dxa" w:w="120"/>
+            </w:tcMar>
+            <w:vAlign w:val="center"/>
+          </w:tcPr>
+          <w:p>
+            <w:r>
+              <w:rPr>
+                <w:color w:val="666666"/>
+                <w:sz w:val="18"/>
+                <w:szCs w:val="18"/>
+              </w:rPr>
+              <w:t xml:space="preserve">25</w:t>
+            </w:r>
+          </w:p>
+        </w:tc>
+        <w:tc>
+          <w:tcPr>
+            <w:tcW w:type="dxa" w:w="3803"/>
+            <w:shd w:fill="F7F7F5" w:val="clear"/>
+            <w:tcMar>
+              <w:top w:type="dxa" w:w="70"/>
+              <w:left w:type="dxa" w:w="120"/>
+              <w:bottom w:type="dxa" w:w="70"/>
+              <w:right w:type="dxa" w:w="120"/>
+            </w:tcMar>
+            <w:vAlign w:val="center"/>
+          </w:tcPr>
+          <w:p>
+            <w:r>
+              <w:rPr>
+                <w:color w:val="222222"/>
+                <w:sz w:val="20"/>
+                <w:szCs w:val="20"/>
+              </w:rPr>
+              <w:t xml:space="preserve">☐</w:t>
+            </w:r>
+          </w:p>
+        </w:tc>
+      </w:tr>
+      <w:tr>
+        <w:trPr>
+          <w:cantSplit/>
+        </w:trPr>
+        <w:tc>
+          <w:tcPr>
+            <w:tcW w:type="dxa" w:w="1300"/>
+            <w:shd w:fill="FFFFFF" w:val="clear"/>
+            <w:tcMar>
+              <w:top w:type="dxa" w:w="70"/>
+              <w:left w:type="dxa" w:w="120"/>
+              <w:bottom w:type="dxa" w:w="70"/>
+              <w:right w:type="dxa" w:w="120"/>
+            </w:tcMar>
+            <w:vAlign w:val="center"/>
+          </w:tcPr>
+          <w:p>
+            <w:r>
+              <w:rPr>
+                <w:color w:val="666666"/>
+                <w:sz w:val="18"/>
+                <w:szCs w:val="18"/>
+              </w:rPr>
+              <w:t xml:space="preserve">11</w:t>
+            </w:r>
+          </w:p>
+        </w:tc>
+        <w:tc>
+          <w:tcPr>
+            <w:tcW w:type="dxa" w:w="3803"/>
+            <w:shd w:fill="FFFFFF" w:val="clear"/>
+            <w:tcMar>
+              <w:top w:type="dxa" w:w="70"/>
+              <w:left w:type="dxa" w:w="120"/>
+              <w:bottom w:type="dxa" w:w="70"/>
+              <w:right w:type="dxa" w:w="120"/>
+            </w:tcMar>
+            <w:vAlign w:val="center"/>
+          </w:tcPr>
+          <w:p>
+            <w:r>
+              <w:rPr>
+                <w:color w:val="222222"/>
+                <w:sz w:val="20"/>
+                <w:szCs w:val="20"/>
+              </w:rPr>
+              <w:t xml:space="preserve">☐</w:t>
+            </w:r>
+          </w:p>
+        </w:tc>
+        <w:tc>
+          <w:tcPr>
+            <w:tcW w:type="dxa" w:w="1300"/>
+            <w:shd w:fill="FFFFFF" w:val="clear"/>
+            <w:tcMar>
+              <w:top w:type="dxa" w:w="70"/>
+              <w:left w:type="dxa" w:w="120"/>
+              <w:bottom w:type="dxa" w:w="70"/>
+              <w:right w:type="dxa" w:w="120"/>
+            </w:tcMar>
+            <w:vAlign w:val="center"/>
+          </w:tcPr>
+          <w:p>
+            <w:r>
+              <w:rPr>
+                <w:color w:val="666666"/>
+                <w:sz w:val="18"/>
+                <w:szCs w:val="18"/>
+              </w:rPr>
+              <w:t xml:space="preserve">26</w:t>
+            </w:r>
+          </w:p>
+        </w:tc>
+        <w:tc>
+          <w:tcPr>
+            <w:tcW w:type="dxa" w:w="3803"/>
+            <w:shd w:fill="FFFFFF" w:val="clear"/>
+            <w:tcMar>
+              <w:top w:type="dxa" w:w="70"/>
+              <w:left w:type="dxa" w:w="120"/>
+              <w:bottom w:type="dxa" w:w="70"/>
+              <w:right w:type="dxa" w:w="120"/>
+            </w:tcMar>
+            <w:vAlign w:val="center"/>
+          </w:tcPr>
+          <w:p>
+            <w:r>
+              <w:rPr>
+                <w:color w:val="222222"/>
+                <w:sz w:val="20"/>
+                <w:szCs w:val="20"/>
+              </w:rPr>
+              <w:t xml:space="preserve">☐</w:t>
+            </w:r>
+          </w:p>
+        </w:tc>
+      </w:tr>
+      <w:tr>
+        <w:trPr>
+          <w:cantSplit/>
+        </w:trPr>
+        <w:tc>
+          <w:tcPr>
+            <w:tcW w:type="dxa" w:w="1300"/>
+            <w:shd w:fill="F7F7F5" w:val="clear"/>
+            <w:tcMar>
+              <w:top w:type="dxa" w:w="70"/>
+              <w:left w:type="dxa" w:w="120"/>
+              <w:bottom w:type="dxa" w:w="70"/>
+              <w:right w:type="dxa" w:w="120"/>
+            </w:tcMar>
+            <w:vAlign w:val="center"/>
+          </w:tcPr>
+          <w:p>
+            <w:r>
+              <w:rPr>
+                <w:color w:val="666666"/>
+                <w:sz w:val="18"/>
+                <w:szCs w:val="18"/>
+              </w:rPr>
+              <w:t xml:space="preserve">12</w:t>
+            </w:r>
+          </w:p>
+        </w:tc>
+        <w:tc>
+          <w:tcPr>
+            <w:tcW w:type="dxa" w:w="3803"/>
+            <w:shd w:fill="F7F7F5" w:val="clear"/>
+            <w:tcMar>
+              <w:top w:type="dxa" w:w="70"/>
+              <w:left w:type="dxa" w:w="120"/>
+              <w:bottom w:type="dxa" w:w="70"/>
+              <w:right w:type="dxa" w:w="120"/>
+            </w:tcMar>
+            <w:vAlign w:val="center"/>
+          </w:tcPr>
+          <w:p>
+            <w:r>
+              <w:rPr>
+                <w:color w:val="222222"/>
+                <w:sz w:val="20"/>
+                <w:szCs w:val="20"/>
+              </w:rPr>
+              <w:t xml:space="preserve">☐</w:t>
+            </w:r>
+          </w:p>
+        </w:tc>
+        <w:tc>
+          <w:tcPr>
+            <w:tcW w:type="dxa" w:w="1300"/>
+            <w:shd w:fill="F7F7F5" w:val="clear"/>
+            <w:tcMar>
+              <w:top w:type="dxa" w:w="70"/>
+              <w:left w:type="dxa" w:w="120"/>
+              <w:bottom w:type="dxa" w:w="70"/>
+              <w:right w:type="dxa" w:w="120"/>
+            </w:tcMar>
+            <w:vAlign w:val="center"/>
+          </w:tcPr>
+          <w:p>
+            <w:r>
+              <w:rPr>
+                <w:color w:val="666666"/>
+                <w:sz w:val="18"/>
+                <w:szCs w:val="18"/>
+              </w:rPr>
+              <w:t xml:space="preserve">27</w:t>
+            </w:r>
+          </w:p>
+        </w:tc>
+        <w:tc>
+          <w:tcPr>
+            <w:tcW w:type="dxa" w:w="3803"/>
+            <w:shd w:fill="F7F7F5" w:val="clear"/>
+            <w:tcMar>
+              <w:top w:type="dxa" w:w="70"/>
+              <w:left w:type="dxa" w:w="120"/>
+              <w:bottom w:type="dxa" w:w="70"/>
+              <w:right w:type="dxa" w:w="120"/>
+            </w:tcMar>
+            <w:vAlign w:val="center"/>
+          </w:tcPr>
+          <w:p>
+            <w:r>
+              <w:rPr>
+                <w:color w:val="222222"/>
+                <w:sz w:val="20"/>
+                <w:szCs w:val="20"/>
+              </w:rPr>
+              <w:t xml:space="preserve">☐</w:t>
+            </w:r>
+          </w:p>
+        </w:tc>
+      </w:tr>
+      <w:tr>
+        <w:trPr>
+          <w:cantSplit/>
+        </w:trPr>
+        <w:tc>
+          <w:tcPr>
+            <w:tcW w:type="dxa" w:w="1300"/>
+            <w:shd w:fill="FFFFFF" w:val="clear"/>
+            <w:tcMar>
+              <w:top w:type="dxa" w:w="70"/>
+              <w:left w:type="dxa" w:w="120"/>
+              <w:bottom w:type="dxa" w:w="70"/>
+              <w:right w:type="dxa" w:w="120"/>
+            </w:tcMar>
+            <w:vAlign w:val="center"/>
+          </w:tcPr>
+          <w:p>
+            <w:r>
+              <w:rPr>
+                <w:color w:val="666666"/>
+                <w:sz w:val="18"/>
+                <w:szCs w:val="18"/>
+              </w:rPr>
+              <w:t xml:space="preserve">13</w:t>
+            </w:r>
+          </w:p>
+        </w:tc>
+        <w:tc>
+          <w:tcPr>
+            <w:tcW w:type="dxa" w:w="3803"/>
+            <w:shd w:fill="FFFFFF" w:val="clear"/>
+            <w:tcMar>
+              <w:top w:type="dxa" w:w="70"/>
+              <w:left w:type="dxa" w:w="120"/>
+              <w:bottom w:type="dxa" w:w="70"/>
+              <w:right w:type="dxa" w:w="120"/>
+            </w:tcMar>
+            <w:vAlign w:val="center"/>
+          </w:tcPr>
+          <w:p>
+            <w:r>
+              <w:rPr>
+                <w:color w:val="222222"/>
+                <w:sz w:val="20"/>
+                <w:szCs w:val="20"/>
+              </w:rPr>
+              <w:t xml:space="preserve">☐</w:t>
+            </w:r>
+          </w:p>
+        </w:tc>
+        <w:tc>
+          <w:tcPr>
+            <w:tcW w:type="dxa" w:w="1300"/>
+            <w:shd w:fill="FFFFFF" w:val="clear"/>
+            <w:tcMar>
+              <w:top w:type="dxa" w:w="70"/>
+              <w:left w:type="dxa" w:w="120"/>
+              <w:bottom w:type="dxa" w:w="70"/>
+              <w:right w:type="dxa" w:w="120"/>
+            </w:tcMar>
+            <w:vAlign w:val="center"/>
+          </w:tcPr>
+          <w:p>
+            <w:r>
+              <w:rPr>
+                <w:color w:val="666666"/>
+                <w:sz w:val="18"/>
+                <w:szCs w:val="18"/>
+              </w:rPr>
+              <w:t xml:space="preserve">28</w:t>
+            </w:r>
+          </w:p>
+        </w:tc>
+        <w:tc>
+          <w:tcPr>
+            <w:tcW w:type="dxa" w:w="3803"/>
+            <w:shd w:fill="FFFFFF" w:val="clear"/>
+            <w:tcMar>
+              <w:top w:type="dxa" w:w="70"/>
+              <w:left w:type="dxa" w:w="120"/>
+              <w:bottom w:type="dxa" w:w="70"/>
+              <w:right w:type="dxa" w:w="120"/>
+            </w:tcMar>
+            <w:vAlign w:val="center"/>
+          </w:tcPr>
+          <w:p>
+            <w:r>
+              <w:rPr>
+                <w:color w:val="222222"/>
+                <w:sz w:val="20"/>
+                <w:szCs w:val="20"/>
+              </w:rPr>
+              <w:t xml:space="preserve">☐</w:t>
+            </w:r>
+          </w:p>
+        </w:tc>
+      </w:tr>
+      <w:tr>
+        <w:trPr>
+          <w:cantSplit/>
+        </w:trPr>
+        <w:tc>
+          <w:tcPr>
+            <w:tcW w:type="dxa" w:w="1300"/>
+            <w:shd w:fill="F7F7F5" w:val="clear"/>
+            <w:tcMar>
+              <w:top w:type="dxa" w:w="70"/>
+              <w:left w:type="dxa" w:w="120"/>
+              <w:bottom w:type="dxa" w:w="70"/>
+              <w:right w:type="dxa" w:w="120"/>
+            </w:tcMar>
+            <w:vAlign w:val="center"/>
+          </w:tcPr>
+          <w:p>
+            <w:r>
+              <w:rPr>
+                <w:color w:val="666666"/>
+                <w:sz w:val="18"/>
+                <w:szCs w:val="18"/>
+              </w:rPr>
+              <w:t xml:space="preserve">14</w:t>
+            </w:r>
+          </w:p>
+        </w:tc>
+        <w:tc>
+          <w:tcPr>
+            <w:tcW w:type="dxa" w:w="3803"/>
+            <w:shd w:fill="F7F7F5" w:val="clear"/>
+            <w:tcMar>
+              <w:top w:type="dxa" w:w="70"/>
+              <w:left w:type="dxa" w:w="120"/>
+              <w:bottom w:type="dxa" w:w="70"/>
+              <w:right w:type="dxa" w:w="120"/>
+            </w:tcMar>
+            <w:vAlign w:val="center"/>
+          </w:tcPr>
+          <w:p>
+            <w:r>
+              <w:rPr>
+                <w:color w:val="222222"/>
+                <w:sz w:val="20"/>
+                <w:szCs w:val="20"/>
+              </w:rPr>
+              <w:t xml:space="preserve">☐</w:t>
+            </w:r>
+          </w:p>
+        </w:tc>
+        <w:tc>
+          <w:tcPr>
+            <w:tcW w:type="dxa" w:w="1300"/>
+            <w:shd w:fill="F7F7F5" w:val="clear"/>
+            <w:tcMar>
+              <w:top w:type="dxa" w:w="70"/>
+              <w:left w:type="dxa" w:w="120"/>
+              <w:bottom w:type="dxa" w:w="70"/>
+              <w:right w:type="dxa" w:w="120"/>
+            </w:tcMar>
+            <w:vAlign w:val="center"/>
+          </w:tcPr>
+          <w:p>
+            <w:r>
+              <w:rPr>
+                <w:color w:val="666666"/>
+                <w:sz w:val="18"/>
+                <w:szCs w:val="18"/>
+              </w:rPr>
+              <w:t xml:space="preserve">29</w:t>
+            </w:r>
+          </w:p>
+        </w:tc>
+        <w:tc>
+          <w:tcPr>
+            <w:tcW w:type="dxa" w:w="3803"/>
+            <w:shd w:fill="F7F7F5" w:val="clear"/>
+            <w:tcMar>
+              <w:top w:type="dxa" w:w="70"/>
+              <w:left w:type="dxa" w:w="120"/>
+              <w:bottom w:type="dxa" w:w="70"/>
+              <w:right w:type="dxa" w:w="120"/>
+            </w:tcMar>
+            <w:vAlign w:val="center"/>
+          </w:tcPr>
+          <w:p>
+            <w:r>
+              <w:rPr>
+                <w:color w:val="222222"/>
+                <w:sz w:val="20"/>
+                <w:szCs w:val="20"/>
+              </w:rPr>
+              <w:t xml:space="preserve">☐</w:t>
+            </w:r>
+          </w:p>
+        </w:tc>
+      </w:tr>
+      <w:tr>
+        <w:trPr>
+          <w:cantSplit/>
+        </w:trPr>
+        <w:tc>
+          <w:tcPr>
+            <w:tcW w:type="dxa" w:w="1300"/>
+            <w:shd w:fill="FFFFFF" w:val="clear"/>
+            <w:tcMar>
+              <w:top w:type="dxa" w:w="70"/>
+              <w:left w:type="dxa" w:w="120"/>
+              <w:bottom w:type="dxa" w:w="70"/>
+              <w:right w:type="dxa" w:w="120"/>
+            </w:tcMar>
+            <w:vAlign w:val="center"/>
+          </w:tcPr>
+          <w:p>
+            <w:r>
+              <w:rPr>
+                <w:color w:val="666666"/>
+                <w:sz w:val="18"/>
+                <w:szCs w:val="18"/>
+              </w:rPr>
+              <w:t xml:space="preserve">15</w:t>
+            </w:r>
+          </w:p>
+        </w:tc>
+        <w:tc>
+          <w:tcPr>
+            <w:tcW w:type="dxa" w:w="3803"/>
+            <w:shd w:fill="FFFFFF" w:val="clear"/>
+            <w:tcMar>
+              <w:top w:type="dxa" w:w="70"/>
+              <w:left w:type="dxa" w:w="120"/>
+              <w:bottom w:type="dxa" w:w="70"/>
+              <w:right w:type="dxa" w:w="120"/>
+            </w:tcMar>
+            <w:vAlign w:val="center"/>
+          </w:tcPr>
+          <w:p>
+            <w:r>
+              <w:rPr>
+                <w:color w:val="222222"/>
+                <w:sz w:val="20"/>
+                <w:szCs w:val="20"/>
+              </w:rPr>
+              <w:t xml:space="preserve">☐</w:t>
+            </w:r>
+          </w:p>
+        </w:tc>
+        <w:tc>
+          <w:tcPr>
+            <w:tcW w:type="dxa" w:w="1300"/>
+            <w:shd w:fill="FFFFFF" w:val="clear"/>
+            <w:tcMar>
+              <w:top w:type="dxa" w:w="70"/>
+              <w:left w:type="dxa" w:w="120"/>
+              <w:bottom w:type="dxa" w:w="70"/>
+              <w:right w:type="dxa" w:w="120"/>
+            </w:tcMar>
+            <w:vAlign w:val="center"/>
+          </w:tcPr>
+          <w:p>
+            <w:r>
+              <w:rPr>
+                <w:color w:val="666666"/>
+                <w:sz w:val="18"/>
+                <w:szCs w:val="18"/>
+              </w:rPr>
+              <w:t xml:space="preserve">30</w:t>
+            </w:r>
+          </w:p>
+        </w:tc>
+        <w:tc>
+          <w:tcPr>
+            <w:tcW w:type="dxa" w:w="3803"/>
+            <w:shd w:fill="FFFFFF" w:val="clear"/>
             <w:tcMar>
               <w:top w:type="dxa" w:w="70"/>
               <w:left w:type="dxa" w:w="120"/>

</xml_diff>